<commit_message>
Refresh the TVSF walkthrough artifacts regenerated by the e2e suite
Output of hitl-tvsf-build-guide.spec.ts during the full 57-spec run: the
library, atomize, upload, pipeline-select, purchase and curation screenshots
plus the downloaded final docx, re-captured against the box rebuilt from
migration 001. Same walkthrough, current build.
</commit_message>
<xml_diff>
--- a/docs/proposals/foundation-tvsf/Foundation_TVSF_FINAL_downloaded.docx
+++ b/docs/proposals/foundation-tvsf/Foundation_TVSF_FINAL_downloaded.docx
@@ -15,7 +15,45 @@
           <w:sz w:val="22"/>
           <w:szCs w:val="22"/>
         </w:rPr>
-        <w:t xml:space="preserve">1. Abstract (public, non-confidential; excluded from the 7-page limit)</w:t>
+        <w:t xml:space="preserve">Abstract</w:t>
+      </w:r>
+    </w:p>
+    <w:p>
+      <w:pPr>
+        <w:spacing w:after="0" w:before="0"/>
+        <w:jc w:val="left"/>
+      </w:pPr>
+      <w:r>
+        <w:rPr>
+          <w:rFonts w:ascii="Times New Roman" w:cs="Times New Roman" w:eastAsia="Times New Roman" w:hAnsi="Times New Roman"/>
+          <w:i/>
+          <w:iCs/>
+          <w:sz w:val="22"/>
+          <w:szCs w:val="22"/>
+        </w:rPr>
+        <w:t xml:space="preserve">(Public, non-confidential — excluded from </w:t>
+      </w:r>
+      <w:r>
+        <w:rPr>
+          <w:rFonts w:ascii="Times New Roman" w:cs="Times New Roman" w:eastAsia="Times New Roman" w:hAnsi="Times New Roman"/>
+          <w:sz w:val="22"/>
+          <w:szCs w:val="22"/>
+        </w:rPr>
+        <w:t xml:space="preserve">the 7-page limit.)</w:t>
+      </w:r>
+    </w:p>
+    <w:p>
+      <w:pPr>
+        <w:spacing w:after="0" w:before="0"/>
+        <w:jc w:val="left"/>
+      </w:pPr>
+      <w:r>
+        <w:rPr>
+          <w:rFonts w:ascii="Times New Roman" w:cs="Times New Roman" w:eastAsia="Times New Roman" w:hAnsi="Times New Roman"/>
+          <w:sz w:val="22"/>
+          <w:szCs w:val="22"/>
+        </w:rPr>
+        <w:t xml:space="preserve">Foundation is an Ohio pre-seed venture that 3D-prints the formwork for residential concrete foundations. By printing the foundation wall shape directly — with common, locally sourced concrete rather than proprietary mortar — Foundation eliminates the traditional build-strip-repair-clean formwork cycle, cutting foundation formwork labor from ~336 hours to ~25 and total formwork cost by roughly 47% on a typical 2,100 sq ft Ohio home. TVSF funds a beta prototype and third-party performance validation, de-risking a $23.7B U.S. formwork market and advancing Ohio's housing-affordability and advanced-manufacturing agenda.</w:t>
       </w:r>
     </w:p>
     <w:p>
@@ -31,7 +69,7 @@
           <w:sz w:val="22"/>
           <w:szCs w:val="22"/>
         </w:rPr>
-        <w:t xml:space="preserve">Abstract</w:t>
+        <w:t xml:space="preserve">#1  Market Opportunity (TAM)</w:t>
       </w:r>
     </w:p>
     <w:p>
@@ -42,20 +80,10 @@
       <w:r>
         <w:rPr>
           <w:rFonts w:ascii="Times New Roman" w:cs="Times New Roman" w:eastAsia="Times New Roman" w:hAnsi="Times New Roman"/>
-          <w:i/>
-          <w:iCs/>
-          <w:sz w:val="22"/>
-          <w:szCs w:val="22"/>
-        </w:rPr>
-        <w:t xml:space="preserve">(Public, non-confidential — excluded from </w:t>
-      </w:r>
-      <w:r>
-        <w:rPr>
-          <w:rFonts w:ascii="Times New Roman" w:cs="Times New Roman" w:eastAsia="Times New Roman" w:hAnsi="Times New Roman"/>
-          <w:sz w:val="22"/>
-          <w:szCs w:val="22"/>
-        </w:rPr>
-        <w:t xml:space="preserve">the 7-page limit.)</w:t>
+          <w:sz w:val="22"/>
+          <w:szCs w:val="22"/>
+        </w:rPr>
+        <w:t xml:space="preserve">The 2026 U.S. housing market represents a $410B TAM against a structural ~500,000-home supply/demand gap; "locked-in" 6% mortgages push builders toward new-build "buy-down" economics where every point of cost removed matters. Foundation targets the formwork line item of single-family new builds — a $23.7B SAM — with an initial serviceable-obtainable $27.4M SOM in its regional beachhead.</w:t>
       </w:r>
     </w:p>
     <w:p>
@@ -69,9 +97,263 @@
           <w:sz w:val="22"/>
           <w:szCs w:val="22"/>
         </w:rPr>
-        <w:t xml:space="preserve">Foundation is an Ohio pre-seed venture that 3D-prints the formwork for residential concrete foundations. By printing the foundation wall shape directly — with common, locally sourced concrete rather than proprietary mortar — Foundation eliminates the traditional build-strip-repair-clean formwork cycle, cutting foundation formwork labor from ~336 hours to ~25 and total formwork cost by roughly 47% on a typical 2,100 sq ft Ohio home. TVSF funds a beta prototype and third-party performance validation, de-risking a $23.7B U.S. formwork market and advancing Ohio's housing-affordability and advanced-manufacturing agenda.</w:t>
-      </w:r>
-    </w:p>
+        <w:t xml:space="preserve">Because foundation 3D printing lowers total home cost ~4% while removing the industry's most labor-intensive, waste-prone step, it converts a cost center into a competitive advantage for builders operating on thin margins.</w:t>
+      </w:r>
+    </w:p>
+    <w:tbl>
+      <w:tblPr>
+        <w:tblW w:type="pct" w:w="100%"/>
+        <w:tblBorders>
+          <w:top w:val="single" w:color="auto" w:sz="4"/>
+          <w:left w:val="single" w:color="auto" w:sz="4"/>
+          <w:bottom w:val="single" w:color="auto" w:sz="4"/>
+          <w:right w:val="single" w:color="auto" w:sz="4"/>
+          <w:insideH w:val="single" w:color="auto" w:sz="4"/>
+          <w:insideV w:val="single" w:color="auto" w:sz="4"/>
+        </w:tblBorders>
+      </w:tblPr>
+      <w:tblGrid>
+        <w:gridCol w:w="100"/>
+        <w:gridCol w:w="100"/>
+        <w:gridCol w:w="100"/>
+      </w:tblGrid>
+      <w:tr>
+        <w:trPr>
+          <w:cantSplit/>
+        </w:trPr>
+        <w:tc>
+          <w:tcPr>
+            <w:tcW w:type="pct" w:w="33.333333333333336%"/>
+            <w:shd w:color="D9E1F2" w:val="solid"/>
+          </w:tcPr>
+          <w:p>
+            <w:pPr>
+              <w:jc w:val="center"/>
+            </w:pPr>
+            <w:r>
+              <w:rPr>
+                <w:rFonts w:ascii="Times New Roman" w:cs="Times New Roman" w:eastAsia="Times New Roman" w:hAnsi="Times New Roman"/>
+                <w:b/>
+                <w:bCs/>
+                <w:sz w:val="22"/>
+                <w:szCs w:val="22"/>
+              </w:rPr>
+              <w:t xml:space="preserve">Market layer</w:t>
+            </w:r>
+          </w:p>
+        </w:tc>
+        <w:tc>
+          <w:tcPr>
+            <w:tcW w:type="pct" w:w="33.333333333333336%"/>
+            <w:shd w:color="D9E1F2" w:val="solid"/>
+          </w:tcPr>
+          <w:p>
+            <w:pPr>
+              <w:jc w:val="center"/>
+            </w:pPr>
+            <w:r>
+              <w:rPr>
+                <w:rFonts w:ascii="Times New Roman" w:cs="Times New Roman" w:eastAsia="Times New Roman" w:hAnsi="Times New Roman"/>
+                <w:b/>
+                <w:bCs/>
+                <w:sz w:val="22"/>
+                <w:szCs w:val="22"/>
+              </w:rPr>
+              <w:t xml:space="preserve">Size</w:t>
+            </w:r>
+          </w:p>
+        </w:tc>
+        <w:tc>
+          <w:tcPr>
+            <w:tcW w:type="pct" w:w="33.333333333333336%"/>
+            <w:shd w:color="D9E1F2" w:val="solid"/>
+          </w:tcPr>
+          <w:p>
+            <w:pPr>
+              <w:jc w:val="center"/>
+            </w:pPr>
+            <w:r>
+              <w:rPr>
+                <w:rFonts w:ascii="Times New Roman" w:cs="Times New Roman" w:eastAsia="Times New Roman" w:hAnsi="Times New Roman"/>
+                <w:b/>
+                <w:bCs/>
+                <w:sz w:val="22"/>
+                <w:szCs w:val="22"/>
+              </w:rPr>
+              <w:t xml:space="preserve">Definition</w:t>
+            </w:r>
+          </w:p>
+        </w:tc>
+      </w:tr>
+      <w:tr>
+        <w:trPr>
+          <w:cantSplit/>
+        </w:trPr>
+        <w:tc>
+          <w:p>
+            <w:pPr>
+              <w:jc w:val="left"/>
+            </w:pPr>
+            <w:r>
+              <w:rPr>
+                <w:rFonts w:ascii="Times New Roman" w:cs="Times New Roman" w:eastAsia="Times New Roman" w:hAnsi="Times New Roman"/>
+                <w:b w:val="false"/>
+                <w:bCs w:val="false"/>
+                <w:sz w:val="22"/>
+                <w:szCs w:val="22"/>
+              </w:rPr>
+              <w:t xml:space="preserve">TAM</w:t>
+            </w:r>
+          </w:p>
+        </w:tc>
+        <w:tc>
+          <w:p>
+            <w:pPr>
+              <w:jc w:val="left"/>
+            </w:pPr>
+            <w:r>
+              <w:rPr>
+                <w:rFonts w:ascii="Times New Roman" w:cs="Times New Roman" w:eastAsia="Times New Roman" w:hAnsi="Times New Roman"/>
+                <w:b w:val="false"/>
+                <w:bCs w:val="false"/>
+                <w:sz w:val="22"/>
+                <w:szCs w:val="22"/>
+              </w:rPr>
+              <w:t xml:space="preserve">$410B</w:t>
+            </w:r>
+          </w:p>
+        </w:tc>
+        <w:tc>
+          <w:p>
+            <w:pPr>
+              <w:jc w:val="left"/>
+            </w:pPr>
+            <w:r>
+              <w:rPr>
+                <w:rFonts w:ascii="Times New Roman" w:cs="Times New Roman" w:eastAsia="Times New Roman" w:hAnsi="Times New Roman"/>
+                <w:b w:val="false"/>
+                <w:bCs w:val="false"/>
+                <w:sz w:val="22"/>
+                <w:szCs w:val="22"/>
+              </w:rPr>
+              <w:t xml:space="preserve">2026 U.S. housing market</w:t>
+            </w:r>
+          </w:p>
+        </w:tc>
+      </w:tr>
+      <w:tr>
+        <w:trPr>
+          <w:cantSplit/>
+        </w:trPr>
+        <w:tc>
+          <w:p>
+            <w:pPr>
+              <w:jc w:val="left"/>
+            </w:pPr>
+            <w:r>
+              <w:rPr>
+                <w:rFonts w:ascii="Times New Roman" w:cs="Times New Roman" w:eastAsia="Times New Roman" w:hAnsi="Times New Roman"/>
+                <w:b w:val="false"/>
+                <w:bCs w:val="false"/>
+                <w:sz w:val="22"/>
+                <w:szCs w:val="22"/>
+              </w:rPr>
+              <w:t xml:space="preserve">SAM</w:t>
+            </w:r>
+          </w:p>
+        </w:tc>
+        <w:tc>
+          <w:p>
+            <w:pPr>
+              <w:jc w:val="left"/>
+            </w:pPr>
+            <w:r>
+              <w:rPr>
+                <w:rFonts w:ascii="Times New Roman" w:cs="Times New Roman" w:eastAsia="Times New Roman" w:hAnsi="Times New Roman"/>
+                <w:b w:val="false"/>
+                <w:bCs w:val="false"/>
+                <w:sz w:val="22"/>
+                <w:szCs w:val="22"/>
+              </w:rPr>
+              <w:t xml:space="preserve">$23.7B</w:t>
+            </w:r>
+          </w:p>
+        </w:tc>
+        <w:tc>
+          <w:p>
+            <w:pPr>
+              <w:jc w:val="left"/>
+            </w:pPr>
+            <w:r>
+              <w:rPr>
+                <w:rFonts w:ascii="Times New Roman" w:cs="Times New Roman" w:eastAsia="Times New Roman" w:hAnsi="Times New Roman"/>
+                <w:b w:val="false"/>
+                <w:bCs w:val="false"/>
+                <w:sz w:val="22"/>
+                <w:szCs w:val="22"/>
+              </w:rPr>
+              <w:t xml:space="preserve">Formwork in single-family new builds</w:t>
+            </w:r>
+          </w:p>
+        </w:tc>
+      </w:tr>
+      <w:tr>
+        <w:trPr>
+          <w:cantSplit/>
+        </w:trPr>
+        <w:tc>
+          <w:p>
+            <w:pPr>
+              <w:jc w:val="left"/>
+            </w:pPr>
+            <w:r>
+              <w:rPr>
+                <w:rFonts w:ascii="Times New Roman" w:cs="Times New Roman" w:eastAsia="Times New Roman" w:hAnsi="Times New Roman"/>
+                <w:b w:val="false"/>
+                <w:bCs w:val="false"/>
+                <w:sz w:val="22"/>
+                <w:szCs w:val="22"/>
+              </w:rPr>
+              <w:t xml:space="preserve">SOM</w:t>
+            </w:r>
+          </w:p>
+        </w:tc>
+        <w:tc>
+          <w:p>
+            <w:pPr>
+              <w:jc w:val="left"/>
+            </w:pPr>
+            <w:r>
+              <w:rPr>
+                <w:rFonts w:ascii="Times New Roman" w:cs="Times New Roman" w:eastAsia="Times New Roman" w:hAnsi="Times New Roman"/>
+                <w:b w:val="false"/>
+                <w:bCs w:val="false"/>
+                <w:sz w:val="22"/>
+                <w:szCs w:val="22"/>
+              </w:rPr>
+              <w:t xml:space="preserve">$27.4M</w:t>
+            </w:r>
+          </w:p>
+        </w:tc>
+        <w:tc>
+          <w:p>
+            <w:pPr>
+              <w:jc w:val="left"/>
+            </w:pPr>
+            <w:r>
+              <w:rPr>
+                <w:rFonts w:ascii="Times New Roman" w:cs="Times New Roman" w:eastAsia="Times New Roman" w:hAnsi="Times New Roman"/>
+                <w:b w:val="false"/>
+                <w:bCs w:val="false"/>
+                <w:sz w:val="22"/>
+                <w:szCs w:val="22"/>
+              </w:rPr>
+              <w:t xml:space="preserve">Near-term regional beachhead</w:t>
+            </w:r>
+          </w:p>
+        </w:tc>
+      </w:tr>
+    </w:tbl>
     <w:p>
       <w:pPr>
         <w:pStyle w:val="Heading1"/>
@@ -85,7 +367,858 @@
           <w:sz w:val="22"/>
           <w:szCs w:val="22"/>
         </w:rPr>
-        <w:t xml:space="preserve">10. #9 Competitive Landscape</w:t>
+        <w:t xml:space="preserve">#2  Overview of the Technology</w:t>
+      </w:r>
+    </w:p>
+    <w:p>
+      <w:pPr>
+        <w:spacing w:after="0" w:before="0"/>
+        <w:jc w:val="left"/>
+      </w:pPr>
+      <w:r>
+        <w:rPr>
+          <w:rFonts w:ascii="Times New Roman" w:cs="Times New Roman" w:eastAsia="Times New Roman" w:hAnsi="Times New Roman"/>
+          <w:sz w:val="22"/>
+          <w:szCs w:val="22"/>
+        </w:rPr>
+        <w:t xml:space="preserve">Foundation's system prints a foundation's wall geometry directly: a build plan is downloaded to the printer, concrete is pumped into the machine, and the nozzle lays concrete one layer at a time. A printing trolley moves laterally and vertically while the whole machine travels along runway rails; the system is electrically powered.</w:t>
+      </w:r>
+    </w:p>
+    <w:p>
+      <w:pPr>
+        <w:spacing w:after="0" w:before="0"/>
+        <w:jc w:val="left"/>
+      </w:pPr>
+      <w:r>
+        <w:rPr>
+          <w:rFonts w:ascii="Times New Roman" w:cs="Times New Roman" w:eastAsia="Times New Roman" w:hAnsi="Times New Roman"/>
+          <w:sz w:val="22"/>
+          <w:szCs w:val="22"/>
+        </w:rPr>
+        <w:t xml:space="preserve">Two differentiators define it:</w:t>
+      </w:r>
+    </w:p>
+    <w:p>
+      <w:pPr>
+        <w:pStyle w:val="ListParagraph"/>
+        <w:numPr>
+          <w:ilvl w:val="0"/>
+          <w:numId w:val="1"/>
+        </w:numPr>
+      </w:pPr>
+      <w:r>
+        <w:rPr>
+          <w:rFonts w:ascii="Times New Roman" w:cs="Times New Roman" w:eastAsia="Times New Roman" w:hAnsi="Times New Roman"/>
+          <w:sz w:val="22"/>
+          <w:szCs w:val="22"/>
+        </w:rPr>
+        <w:t xml:space="preserve">It uses common, locally sourced concrete — not an expensive proprietary mortar.</w:t>
+      </w:r>
+    </w:p>
+    <w:p>
+      <w:pPr>
+        <w:pStyle w:val="ListParagraph"/>
+        <w:numPr>
+          <w:ilvl w:val="0"/>
+          <w:numId w:val="1"/>
+        </w:numPr>
+      </w:pPr>
+      <w:r>
+        <w:rPr>
+          <w:rFonts w:ascii="Times New Roman" w:cs="Times New Roman" w:eastAsia="Times New Roman" w:hAnsi="Times New Roman"/>
+          <w:sz w:val="22"/>
+          <w:szCs w:val="22"/>
+        </w:rPr>
+        <w:t xml:space="preserve">An external gate controls material flow at the nozzle, enabling clean starts/stops and consistent layers.</w:t>
+      </w:r>
+    </w:p>
+    <w:p>
+      <w:pPr>
+        <w:spacing w:after="0" w:before="0"/>
+        <w:jc w:val="left"/>
+      </w:pPr>
+      <w:r>
+        <w:rPr>
+          <w:rFonts w:ascii="Times New Roman" w:cs="Times New Roman" w:eastAsia="Times New Roman" w:hAnsi="Times New Roman"/>
+          <w:sz w:val="22"/>
+          <w:szCs w:val="22"/>
+        </w:rPr>
+        <w:t xml:space="preserve">The net effect eliminates the build-strip-repair-clean cycle, saving ~311 labor hours per home and cutting formwork production cost ~47–50% and material cost ~60–65% versus mortar-based concrete printers.</w:t>
+      </w:r>
+    </w:p>
+    <w:p>
+      <w:pPr>
+        <w:pStyle w:val="Heading1"/>
+        <w:keepNext/>
+      </w:pPr>
+      <w:r>
+        <w:rPr>
+          <w:rFonts w:ascii="Times New Roman" w:cs="Times New Roman" w:eastAsia="Times New Roman" w:hAnsi="Times New Roman"/>
+          <w:b/>
+          <w:bCs/>
+          <w:sz w:val="22"/>
+          <w:szCs w:val="22"/>
+        </w:rPr>
+        <w:t xml:space="preserve">#3  Development Stage</w:t>
+      </w:r>
+    </w:p>
+    <w:p>
+      <w:pPr>
+        <w:spacing w:after="0" w:before="0"/>
+        <w:jc w:val="left"/>
+      </w:pPr>
+      <w:r>
+        <w:rPr>
+          <w:rFonts w:ascii="Times New Roman" w:cs="Times New Roman" w:eastAsia="Times New Roman" w:hAnsi="Times New Roman"/>
+          <w:sz w:val="22"/>
+          <w:szCs w:val="22"/>
+        </w:rPr>
+        <w:t xml:space="preserve">The technology is at TRL 6–7: core subsystems (concrete delivery, nozzle gate, gantry motion) are demonstrated and the team is building a beta prototype for a relevant application environment. MVP customer requirements are explicit — rapid deployment, reduced labor, structural reliability, and use of locally sourced materials.</w:t>
+      </w:r>
+    </w:p>
+    <w:p>
+      <w:pPr>
+        <w:spacing w:after="0" w:before="0"/>
+        <w:jc w:val="left"/>
+      </w:pPr>
+      <w:r>
+        <w:rPr>
+          <w:rFonts w:ascii="Times New Roman" w:cs="Times New Roman" w:eastAsia="Times New Roman" w:hAnsi="Times New Roman"/>
+          <w:sz w:val="22"/>
+          <w:szCs w:val="22"/>
+        </w:rPr>
+        <w:t xml:space="preserve">TVSF's role is to fund the beta prototype build and an independent third-party performance validation, moving the system from demonstrated subsystems (TRL 6–7) toward a field-validated first printer (TRL 7–8).</w:t>
+      </w:r>
+    </w:p>
+    <w:p>
+      <w:pPr>
+        <w:pStyle w:val="Heading1"/>
+        <w:keepNext/>
+      </w:pPr>
+      <w:r>
+        <w:rPr>
+          <w:rFonts w:ascii="Times New Roman" w:cs="Times New Roman" w:eastAsia="Times New Roman" w:hAnsi="Times New Roman"/>
+          <w:b/>
+          <w:bCs/>
+          <w:sz w:val="22"/>
+          <w:szCs w:val="22"/>
+        </w:rPr>
+        <w:t xml:space="preserve">#4  Commercialization Strategy (SAM)</w:t>
+      </w:r>
+    </w:p>
+    <w:p>
+      <w:pPr>
+        <w:spacing w:after="0" w:before="0"/>
+        <w:jc w:val="left"/>
+      </w:pPr>
+      <w:r>
+        <w:rPr>
+          <w:rFonts w:ascii="Times New Roman" w:cs="Times New Roman" w:eastAsia="Times New Roman" w:hAnsi="Times New Roman"/>
+          <w:sz w:val="22"/>
+          <w:szCs w:val="22"/>
+        </w:rPr>
+        <w:t xml:space="preserve">Entry is proof-based: local, fragmented buyers whose barriers are trust, portability, and cost, and whose workflow already relies on subcontractors. Foundation sells into that workflow as "printing as a service" to general contractors and developers, priced per cubic yard of concrete, and partners with local schools and builders for demos and workforce pipeline.</w:t>
+      </w:r>
+    </w:p>
+    <w:p>
+      <w:pPr>
+        <w:spacing w:after="0" w:before="0"/>
+        <w:jc w:val="left"/>
+      </w:pPr>
+      <w:r>
+        <w:rPr>
+          <w:rFonts w:ascii="Times New Roman" w:cs="Times New Roman" w:eastAsia="Times New Roman" w:hAnsi="Times New Roman"/>
+          <w:sz w:val="22"/>
+          <w:szCs w:val="22"/>
+        </w:rPr>
+        <w:t xml:space="preserve">The motion is demos/tours → paid pilot → repeat jobs, using non-dilutive TVSF + SBIR Phase I to reach a validated pilot before scaling into the $23.7B formwork SAM.</w:t>
+      </w:r>
+    </w:p>
+    <w:p>
+      <w:pPr>
+        <w:pStyle w:val="Heading1"/>
+        <w:keepNext/>
+      </w:pPr>
+      <w:r>
+        <w:rPr>
+          <w:rFonts w:ascii="Times New Roman" w:cs="Times New Roman" w:eastAsia="Times New Roman" w:hAnsi="Times New Roman"/>
+          <w:b/>
+          <w:bCs/>
+          <w:sz w:val="22"/>
+          <w:szCs w:val="22"/>
+        </w:rPr>
+        <w:t xml:space="preserve">#5  Intellectual Property</w:t>
+      </w:r>
+    </w:p>
+    <w:p>
+      <w:pPr>
+        <w:spacing w:after="0" w:before="0"/>
+        <w:jc w:val="left"/>
+      </w:pPr>
+      <w:r>
+        <w:rPr>
+          <w:rFonts w:ascii="Times New Roman" w:cs="Times New Roman" w:eastAsia="Times New Roman" w:hAnsi="Times New Roman"/>
+          <w:sz w:val="22"/>
+          <w:szCs w:val="22"/>
+        </w:rPr>
+        <w:t xml:space="preserve">Foundation's approach is anchored by two issued U.S. patents:</w:t>
+      </w:r>
+    </w:p>
+    <w:p>
+      <w:pPr>
+        <w:pStyle w:val="ListParagraph"/>
+        <w:numPr>
+          <w:ilvl w:val="0"/>
+          <w:numId w:val="1"/>
+        </w:numPr>
+      </w:pPr>
+      <w:r>
+        <w:rPr>
+          <w:rFonts w:ascii="Times New Roman" w:cs="Times New Roman" w:eastAsia="Times New Roman" w:hAnsi="Times New Roman"/>
+          <w:sz w:val="22"/>
+          <w:szCs w:val="22"/>
+        </w:rPr>
+        <w:t xml:space="preserve">U.S. Patent 11,273,574 — "Scalable Three-Dimensional Printing Apparatus" (the scalable gantry/print architecture).</w:t>
+      </w:r>
+    </w:p>
+    <w:p>
+      <w:pPr>
+        <w:pStyle w:val="ListParagraph"/>
+        <w:numPr>
+          <w:ilvl w:val="0"/>
+          <w:numId w:val="1"/>
+        </w:numPr>
+      </w:pPr>
+      <w:r>
+        <w:rPr>
+          <w:rFonts w:ascii="Times New Roman" w:cs="Times New Roman" w:eastAsia="Times New Roman" w:hAnsi="Times New Roman"/>
+          <w:sz w:val="22"/>
+          <w:szCs w:val="22"/>
+        </w:rPr>
+        <w:t xml:space="preserve">U.S. Patent 10,307,959 B2 — "Concrete Delivery System" (the concrete-delivery and nozzle-control mechanism).</w:t>
+      </w:r>
+    </w:p>
+    <w:p>
+      <w:pPr>
+        <w:spacing w:after="0" w:before="0"/>
+        <w:jc w:val="left"/>
+      </w:pPr>
+      <w:r>
+        <w:rPr>
+          <w:rFonts w:ascii="Times New Roman" w:cs="Times New Roman" w:eastAsia="Times New Roman" w:hAnsi="Times New Roman"/>
+          <w:sz w:val="22"/>
+          <w:szCs w:val="22"/>
+        </w:rPr>
+        <w:t xml:space="preserve">Together they protect the two core differentiators — the rail-scalable printer and the externally gated, local-concrete delivery path. Freedom-to-operate and a continuation strategy around the nozzle-gate control are part of the funded work.</w:t>
+      </w:r>
+    </w:p>
+    <w:p>
+      <w:pPr>
+        <w:pStyle w:val="Heading1"/>
+        <w:keepNext/>
+      </w:pPr>
+      <w:r>
+        <w:rPr>
+          <w:rFonts w:ascii="Times New Roman" w:cs="Times New Roman" w:eastAsia="Times New Roman" w:hAnsi="Times New Roman"/>
+          <w:b/>
+          <w:bCs/>
+          <w:sz w:val="22"/>
+          <w:szCs w:val="22"/>
+        </w:rPr>
+        <w:t xml:space="preserve">#6  Business Model &amp; Pro-forma P&amp;L</w:t>
+      </w:r>
+    </w:p>
+    <w:p>
+      <w:pPr>
+        <w:spacing w:after="0" w:before="0"/>
+        <w:jc w:val="left"/>
+      </w:pPr>
+      <w:r>
+        <w:rPr>
+          <w:rFonts w:ascii="Times New Roman" w:cs="Times New Roman" w:eastAsia="Times New Roman" w:hAnsi="Times New Roman"/>
+          <w:sz w:val="22"/>
+          <w:szCs w:val="22"/>
+        </w:rPr>
+        <w:t xml:space="preserve">Foundation forms a joint venture per project, programs and prepares the print, and charges per cubic yard of concrete placed, at ≈$20,000 total price per job with a contribution margin of ≈37.5%. Printing-as-a-service keeps capital with Foundation and lowers the builder's barrier to adoption.</w:t>
+      </w:r>
+    </w:p>
+    <w:tbl>
+      <w:tblPr>
+        <w:tblW w:type="pct" w:w="100%"/>
+        <w:tblBorders>
+          <w:top w:val="single" w:color="auto" w:sz="4"/>
+          <w:left w:val="single" w:color="auto" w:sz="4"/>
+          <w:bottom w:val="single" w:color="auto" w:sz="4"/>
+          <w:right w:val="single" w:color="auto" w:sz="4"/>
+          <w:insideH w:val="single" w:color="auto" w:sz="4"/>
+          <w:insideV w:val="single" w:color="auto" w:sz="4"/>
+        </w:tblBorders>
+      </w:tblPr>
+      <w:tblGrid>
+        <w:gridCol w:w="100"/>
+        <w:gridCol w:w="100"/>
+      </w:tblGrid>
+      <w:tr>
+        <w:trPr>
+          <w:cantSplit/>
+        </w:trPr>
+        <w:tc>
+          <w:tcPr>
+            <w:tcW w:type="pct" w:w="50%"/>
+            <w:shd w:color="D9E1F2" w:val="solid"/>
+          </w:tcPr>
+          <w:p>
+            <w:pPr>
+              <w:jc w:val="center"/>
+            </w:pPr>
+            <w:r>
+              <w:rPr>
+                <w:rFonts w:ascii="Times New Roman" w:cs="Times New Roman" w:eastAsia="Times New Roman" w:hAnsi="Times New Roman"/>
+                <w:b/>
+                <w:bCs/>
+                <w:sz w:val="22"/>
+                <w:szCs w:val="22"/>
+              </w:rPr>
+              <w:t xml:space="preserve">Pro-forma (per job, illustrative)</w:t>
+            </w:r>
+          </w:p>
+        </w:tc>
+        <w:tc>
+          <w:tcPr>
+            <w:tcW w:type="pct" w:w="50%"/>
+            <w:shd w:color="D9E1F2" w:val="solid"/>
+          </w:tcPr>
+          <w:p>
+            <w:pPr>
+              <w:jc w:val="center"/>
+            </w:pPr>
+            <w:r>
+              <w:rPr>
+                <w:rFonts w:ascii="Times New Roman" w:cs="Times New Roman" w:eastAsia="Times New Roman" w:hAnsi="Times New Roman"/>
+                <w:b/>
+                <w:bCs/>
+                <w:sz w:val="22"/>
+                <w:szCs w:val="22"/>
+              </w:rPr>
+              <w:t xml:space="preserve">Value</w:t>
+            </w:r>
+          </w:p>
+        </w:tc>
+      </w:tr>
+      <w:tr>
+        <w:trPr>
+          <w:cantSplit/>
+        </w:trPr>
+        <w:tc>
+          <w:p>
+            <w:pPr>
+              <w:jc w:val="left"/>
+            </w:pPr>
+            <w:r>
+              <w:rPr>
+                <w:rFonts w:ascii="Times New Roman" w:cs="Times New Roman" w:eastAsia="Times New Roman" w:hAnsi="Times New Roman"/>
+                <w:b w:val="false"/>
+                <w:bCs w:val="false"/>
+                <w:sz w:val="22"/>
+                <w:szCs w:val="22"/>
+              </w:rPr>
+              <w:t xml:space="preserve">Price per job</w:t>
+            </w:r>
+          </w:p>
+        </w:tc>
+        <w:tc>
+          <w:p>
+            <w:pPr>
+              <w:jc w:val="left"/>
+            </w:pPr>
+            <w:r>
+              <w:rPr>
+                <w:rFonts w:ascii="Times New Roman" w:cs="Times New Roman" w:eastAsia="Times New Roman" w:hAnsi="Times New Roman"/>
+                <w:b w:val="false"/>
+                <w:bCs w:val="false"/>
+                <w:sz w:val="22"/>
+                <w:szCs w:val="22"/>
+              </w:rPr>
+              <w:t xml:space="preserve">$20,000</w:t>
+            </w:r>
+          </w:p>
+        </w:tc>
+      </w:tr>
+      <w:tr>
+        <w:trPr>
+          <w:cantSplit/>
+        </w:trPr>
+        <w:tc>
+          <w:p>
+            <w:pPr>
+              <w:jc w:val="left"/>
+            </w:pPr>
+            <w:r>
+              <w:rPr>
+                <w:rFonts w:ascii="Times New Roman" w:cs="Times New Roman" w:eastAsia="Times New Roman" w:hAnsi="Times New Roman"/>
+                <w:b w:val="false"/>
+                <w:bCs w:val="false"/>
+                <w:sz w:val="22"/>
+                <w:szCs w:val="22"/>
+              </w:rPr>
+              <w:t xml:space="preserve">Contribution margin</w:t>
+            </w:r>
+          </w:p>
+        </w:tc>
+        <w:tc>
+          <w:p>
+            <w:pPr>
+              <w:jc w:val="left"/>
+            </w:pPr>
+            <w:r>
+              <w:rPr>
+                <w:rFonts w:ascii="Times New Roman" w:cs="Times New Roman" w:eastAsia="Times New Roman" w:hAnsi="Times New Roman"/>
+                <w:b w:val="false"/>
+                <w:bCs w:val="false"/>
+                <w:sz w:val="22"/>
+                <w:szCs w:val="22"/>
+              </w:rPr>
+              <w:t xml:space="preserve">≈37.5%</w:t>
+            </w:r>
+          </w:p>
+        </w:tc>
+      </w:tr>
+      <w:tr>
+        <w:trPr>
+          <w:cantSplit/>
+        </w:trPr>
+        <w:tc>
+          <w:p>
+            <w:pPr>
+              <w:jc w:val="left"/>
+            </w:pPr>
+            <w:r>
+              <w:rPr>
+                <w:rFonts w:ascii="Times New Roman" w:cs="Times New Roman" w:eastAsia="Times New Roman" w:hAnsi="Times New Roman"/>
+                <w:b w:val="false"/>
+                <w:bCs w:val="false"/>
+                <w:sz w:val="22"/>
+                <w:szCs w:val="22"/>
+              </w:rPr>
+              <w:t xml:space="preserve">Contribution per job</w:t>
+            </w:r>
+          </w:p>
+        </w:tc>
+        <w:tc>
+          <w:p>
+            <w:pPr>
+              <w:jc w:val="left"/>
+            </w:pPr>
+            <w:r>
+              <w:rPr>
+                <w:rFonts w:ascii="Times New Roman" w:cs="Times New Roman" w:eastAsia="Times New Roman" w:hAnsi="Times New Roman"/>
+                <w:b w:val="false"/>
+                <w:bCs w:val="false"/>
+                <w:sz w:val="22"/>
+                <w:szCs w:val="22"/>
+              </w:rPr>
+              <w:t xml:space="preserve">$7,500</w:t>
+            </w:r>
+          </w:p>
+        </w:tc>
+      </w:tr>
+    </w:tbl>
+    <w:p>
+      <w:pPr>
+        <w:spacing w:after="0" w:before="0"/>
+        <w:jc w:val="left"/>
+      </w:pPr>
+      <w:r>
+        <w:rPr>
+          <w:rFonts w:ascii="Times New Roman" w:cs="Times New Roman" w:eastAsia="Times New Roman" w:hAnsi="Times New Roman"/>
+          <w:sz w:val="22"/>
+          <w:szCs w:val="22"/>
+        </w:rPr>
+        <w:t xml:space="preserve">Against a $27.4M near-term SOM, a modest fleet of printers running repeat jobs reaches sustainable unit economics quickly; gross margin expands as printer utilization rises.</w:t>
+      </w:r>
+    </w:p>
+    <w:p>
+      <w:pPr>
+        <w:pStyle w:val="Heading1"/>
+        <w:keepNext/>
+      </w:pPr>
+      <w:r>
+        <w:rPr>
+          <w:rFonts w:ascii="Times New Roman" w:cs="Times New Roman" w:eastAsia="Times New Roman" w:hAnsi="Times New Roman"/>
+          <w:b/>
+          <w:bCs/>
+          <w:sz w:val="22"/>
+          <w:szCs w:val="22"/>
+        </w:rPr>
+        <w:t xml:space="preserve">#7  Current Financial Stage &amp; Fundraising</w:t>
+      </w:r>
+    </w:p>
+    <w:p>
+      <w:pPr>
+        <w:spacing w:after="0" w:before="0"/>
+        <w:jc w:val="left"/>
+      </w:pPr>
+      <w:r>
+        <w:rPr>
+          <w:rFonts w:ascii="Times New Roman" w:cs="Times New Roman" w:eastAsia="Times New Roman" w:hAnsi="Times New Roman"/>
+          <w:sz w:val="22"/>
+          <w:szCs w:val="22"/>
+        </w:rPr>
+        <w:t xml:space="preserve">Foundation is pre-seed. The capital plan pairs $200k TVSF and $150k SBIR Phase I (non-dilutive, directed at R&amp;D and the beta prototype) with a targeted $1.8M+ equity round.</w:t>
+      </w:r>
+    </w:p>
+    <w:p>
+      <w:pPr>
+        <w:spacing w:after="0" w:before="0"/>
+        <w:jc w:val="left"/>
+      </w:pPr>
+      <w:r>
+        <w:rPr>
+          <w:rFonts w:ascii="Times New Roman" w:cs="Times New Roman" w:eastAsia="Times New Roman" w:hAnsi="Times New Roman"/>
+          <w:sz w:val="22"/>
+          <w:szCs w:val="22"/>
+        </w:rPr>
+        <w:t xml:space="preserve">Equity investment is critical to scaling beyond the first printer; the non-dilutive grants exist to prove the market and de-risk the technology first, so the equity raise is priced on validated performance rather than on a concept. TVSF is the near-term unlock for the validated beta prototype that makes the round investable.</w:t>
+      </w:r>
+    </w:p>
+    <w:p>
+      <w:pPr>
+        <w:pStyle w:val="Heading1"/>
+        <w:keepNext/>
+      </w:pPr>
+      <w:r>
+        <w:rPr>
+          <w:rFonts w:ascii="Times New Roman" w:cs="Times New Roman" w:eastAsia="Times New Roman" w:hAnsi="Times New Roman"/>
+          <w:b/>
+          <w:bCs/>
+          <w:sz w:val="22"/>
+          <w:szCs w:val="22"/>
+        </w:rPr>
+        <w:t xml:space="preserve">#8  Team / Management</w:t>
+      </w:r>
+    </w:p>
+    <w:tbl>
+      <w:tblPr>
+        <w:tblW w:type="pct" w:w="100%"/>
+        <w:tblBorders>
+          <w:top w:val="single" w:color="auto" w:sz="4"/>
+          <w:left w:val="single" w:color="auto" w:sz="4"/>
+          <w:bottom w:val="single" w:color="auto" w:sz="4"/>
+          <w:right w:val="single" w:color="auto" w:sz="4"/>
+          <w:insideH w:val="single" w:color="auto" w:sz="4"/>
+          <w:insideV w:val="single" w:color="auto" w:sz="4"/>
+        </w:tblBorders>
+      </w:tblPr>
+      <w:tblGrid>
+        <w:gridCol w:w="100"/>
+        <w:gridCol w:w="100"/>
+        <w:gridCol w:w="100"/>
+      </w:tblGrid>
+      <w:tr>
+        <w:trPr>
+          <w:cantSplit/>
+        </w:trPr>
+        <w:tc>
+          <w:tcPr>
+            <w:tcW w:type="pct" w:w="33.333333333333336%"/>
+            <w:shd w:color="D9E1F2" w:val="solid"/>
+          </w:tcPr>
+          <w:p>
+            <w:pPr>
+              <w:jc w:val="center"/>
+            </w:pPr>
+            <w:r>
+              <w:rPr>
+                <w:rFonts w:ascii="Times New Roman" w:cs="Times New Roman" w:eastAsia="Times New Roman" w:hAnsi="Times New Roman"/>
+                <w:b/>
+                <w:bCs/>
+                <w:sz w:val="22"/>
+                <w:szCs w:val="22"/>
+              </w:rPr>
+              <w:t xml:space="preserve">Name</w:t>
+            </w:r>
+          </w:p>
+        </w:tc>
+        <w:tc>
+          <w:tcPr>
+            <w:tcW w:type="pct" w:w="33.333333333333336%"/>
+            <w:shd w:color="D9E1F2" w:val="solid"/>
+          </w:tcPr>
+          <w:p>
+            <w:pPr>
+              <w:jc w:val="center"/>
+            </w:pPr>
+            <w:r>
+              <w:rPr>
+                <w:rFonts w:ascii="Times New Roman" w:cs="Times New Roman" w:eastAsia="Times New Roman" w:hAnsi="Times New Roman"/>
+                <w:b/>
+                <w:bCs/>
+                <w:sz w:val="22"/>
+                <w:szCs w:val="22"/>
+              </w:rPr>
+              <w:t xml:space="preserve">Role</w:t>
+            </w:r>
+          </w:p>
+        </w:tc>
+        <w:tc>
+          <w:tcPr>
+            <w:tcW w:type="pct" w:w="33.333333333333336%"/>
+            <w:shd w:color="D9E1F2" w:val="solid"/>
+          </w:tcPr>
+          <w:p>
+            <w:pPr>
+              <w:jc w:val="center"/>
+            </w:pPr>
+            <w:r>
+              <w:rPr>
+                <w:rFonts w:ascii="Times New Roman" w:cs="Times New Roman" w:eastAsia="Times New Roman" w:hAnsi="Times New Roman"/>
+                <w:b/>
+                <w:bCs/>
+                <w:sz w:val="22"/>
+                <w:szCs w:val="22"/>
+              </w:rPr>
+              <w:t xml:space="preserve">Owns</w:t>
+            </w:r>
+          </w:p>
+        </w:tc>
+      </w:tr>
+      <w:tr>
+        <w:trPr>
+          <w:cantSplit/>
+        </w:trPr>
+        <w:tc>
+          <w:p>
+            <w:pPr>
+              <w:jc w:val="left"/>
+            </w:pPr>
+            <w:r>
+              <w:rPr>
+                <w:rFonts w:ascii="Times New Roman" w:cs="Times New Roman" w:eastAsia="Times New Roman" w:hAnsi="Times New Roman"/>
+                <w:b w:val="false"/>
+                <w:bCs w:val="false"/>
+                <w:sz w:val="22"/>
+                <w:szCs w:val="22"/>
+              </w:rPr>
+              <w:t xml:space="preserve">Kate Ulepic</w:t>
+            </w:r>
+          </w:p>
+        </w:tc>
+        <w:tc>
+          <w:p>
+            <w:pPr>
+              <w:jc w:val="left"/>
+            </w:pPr>
+            <w:r>
+              <w:rPr>
+                <w:rFonts w:ascii="Times New Roman" w:cs="Times New Roman" w:eastAsia="Times New Roman" w:hAnsi="Times New Roman"/>
+                <w:b w:val="false"/>
+                <w:bCs w:val="false"/>
+                <w:sz w:val="22"/>
+                <w:szCs w:val="22"/>
+              </w:rPr>
+              <w:t xml:space="preserve">Chief Executive Officer</w:t>
+            </w:r>
+          </w:p>
+        </w:tc>
+        <w:tc>
+          <w:p>
+            <w:pPr>
+              <w:jc w:val="left"/>
+            </w:pPr>
+            <w:r>
+              <w:rPr>
+                <w:rFonts w:ascii="Times New Roman" w:cs="Times New Roman" w:eastAsia="Times New Roman" w:hAnsi="Times New Roman"/>
+                <w:b w:val="false"/>
+                <w:bCs w:val="false"/>
+                <w:sz w:val="22"/>
+                <w:szCs w:val="22"/>
+              </w:rPr>
+              <w:t xml:space="preserve">Strategy &amp; fundraising</w:t>
+            </w:r>
+          </w:p>
+        </w:tc>
+      </w:tr>
+      <w:tr>
+        <w:trPr>
+          <w:cantSplit/>
+        </w:trPr>
+        <w:tc>
+          <w:p>
+            <w:pPr>
+              <w:jc w:val="left"/>
+            </w:pPr>
+            <w:r>
+              <w:rPr>
+                <w:rFonts w:ascii="Times New Roman" w:cs="Times New Roman" w:eastAsia="Times New Roman" w:hAnsi="Times New Roman"/>
+                <w:b w:val="false"/>
+                <w:bCs w:val="false"/>
+                <w:sz w:val="22"/>
+                <w:szCs w:val="22"/>
+              </w:rPr>
+              <w:t xml:space="preserve">Conor Atkins</w:t>
+            </w:r>
+          </w:p>
+        </w:tc>
+        <w:tc>
+          <w:p>
+            <w:pPr>
+              <w:jc w:val="left"/>
+            </w:pPr>
+            <w:r>
+              <w:rPr>
+                <w:rFonts w:ascii="Times New Roman" w:cs="Times New Roman" w:eastAsia="Times New Roman" w:hAnsi="Times New Roman"/>
+                <w:b w:val="false"/>
+                <w:bCs w:val="false"/>
+                <w:sz w:val="22"/>
+                <w:szCs w:val="22"/>
+              </w:rPr>
+              <w:t xml:space="preserve">Chief Operations Officer</w:t>
+            </w:r>
+          </w:p>
+        </w:tc>
+        <w:tc>
+          <w:p>
+            <w:pPr>
+              <w:jc w:val="left"/>
+            </w:pPr>
+            <w:r>
+              <w:rPr>
+                <w:rFonts w:ascii="Times New Roman" w:cs="Times New Roman" w:eastAsia="Times New Roman" w:hAnsi="Times New Roman"/>
+                <w:b w:val="false"/>
+                <w:bCs w:val="false"/>
+                <w:sz w:val="22"/>
+                <w:szCs w:val="22"/>
+              </w:rPr>
+              <w:t xml:space="preserve">Operations &amp; print execution</w:t>
+            </w:r>
+          </w:p>
+        </w:tc>
+      </w:tr>
+      <w:tr>
+        <w:trPr>
+          <w:cantSplit/>
+        </w:trPr>
+        <w:tc>
+          <w:p>
+            <w:pPr>
+              <w:jc w:val="left"/>
+            </w:pPr>
+            <w:r>
+              <w:rPr>
+                <w:rFonts w:ascii="Times New Roman" w:cs="Times New Roman" w:eastAsia="Times New Roman" w:hAnsi="Times New Roman"/>
+                <w:b w:val="false"/>
+                <w:bCs w:val="false"/>
+                <w:sz w:val="22"/>
+                <w:szCs w:val="22"/>
+              </w:rPr>
+              <w:t xml:space="preserve">Connor Casey</w:t>
+            </w:r>
+          </w:p>
+        </w:tc>
+        <w:tc>
+          <w:p>
+            <w:pPr>
+              <w:jc w:val="left"/>
+            </w:pPr>
+            <w:r>
+              <w:rPr>
+                <w:rFonts w:ascii="Times New Roman" w:cs="Times New Roman" w:eastAsia="Times New Roman" w:hAnsi="Times New Roman"/>
+                <w:b w:val="false"/>
+                <w:bCs w:val="false"/>
+                <w:sz w:val="22"/>
+                <w:szCs w:val="22"/>
+              </w:rPr>
+              <w:t xml:space="preserve">Chief Financial Officer</w:t>
+            </w:r>
+          </w:p>
+        </w:tc>
+        <w:tc>
+          <w:p>
+            <w:pPr>
+              <w:jc w:val="left"/>
+            </w:pPr>
+            <w:r>
+              <w:rPr>
+                <w:rFonts w:ascii="Times New Roman" w:cs="Times New Roman" w:eastAsia="Times New Roman" w:hAnsi="Times New Roman"/>
+                <w:b w:val="false"/>
+                <w:bCs w:val="false"/>
+                <w:sz w:val="22"/>
+                <w:szCs w:val="22"/>
+              </w:rPr>
+              <w:t xml:space="preserve">Finance &amp; capital plan</w:t>
+            </w:r>
+          </w:p>
+        </w:tc>
+      </w:tr>
+      <w:tr>
+        <w:trPr>
+          <w:cantSplit/>
+        </w:trPr>
+        <w:tc>
+          <w:p>
+            <w:pPr>
+              <w:jc w:val="left"/>
+            </w:pPr>
+            <w:r>
+              <w:rPr>
+                <w:rFonts w:ascii="Times New Roman" w:cs="Times New Roman" w:eastAsia="Times New Roman" w:hAnsi="Times New Roman"/>
+                <w:b w:val="false"/>
+                <w:bCs w:val="false"/>
+                <w:sz w:val="22"/>
+                <w:szCs w:val="22"/>
+              </w:rPr>
+              <w:t xml:space="preserve">Will Curley</w:t>
+            </w:r>
+          </w:p>
+        </w:tc>
+        <w:tc>
+          <w:p>
+            <w:pPr>
+              <w:jc w:val="left"/>
+            </w:pPr>
+            <w:r>
+              <w:rPr>
+                <w:rFonts w:ascii="Times New Roman" w:cs="Times New Roman" w:eastAsia="Times New Roman" w:hAnsi="Times New Roman"/>
+                <w:b w:val="false"/>
+                <w:bCs w:val="false"/>
+                <w:sz w:val="22"/>
+                <w:szCs w:val="22"/>
+              </w:rPr>
+              <w:t xml:space="preserve">Chief Technology Officer</w:t>
+            </w:r>
+          </w:p>
+        </w:tc>
+        <w:tc>
+          <w:p>
+            <w:pPr>
+              <w:jc w:val="left"/>
+            </w:pPr>
+            <w:r>
+              <w:rPr>
+                <w:rFonts w:ascii="Times New Roman" w:cs="Times New Roman" w:eastAsia="Times New Roman" w:hAnsi="Times New Roman"/>
+                <w:b w:val="false"/>
+                <w:bCs w:val="false"/>
+                <w:sz w:val="22"/>
+                <w:szCs w:val="22"/>
+              </w:rPr>
+              <w:t xml:space="preserve">Printer &amp; delivery technology</w:t>
+            </w:r>
+          </w:p>
+        </w:tc>
+      </w:tr>
+    </w:tbl>
+    <w:p>
+      <w:pPr>
+        <w:spacing w:after="0" w:before="0"/>
+        <w:jc w:val="left"/>
+      </w:pPr>
+      <w:r>
+        <w:rPr>
+          <w:rFonts w:ascii="Times New Roman" w:cs="Times New Roman" w:eastAsia="Times New Roman" w:hAnsi="Times New Roman"/>
+          <w:sz w:val="22"/>
+          <w:szCs w:val="22"/>
+        </w:rPr>
+        <w:t xml:space="preserve">The team has identified and is actively recruiting for its known gaps — legal advisor, fundraiser, technician, and homebuilder partner — and is mentored through the Entrepreneurs' Center (Paul Jackson, VP Strategic Programs).</w:t>
       </w:r>
     </w:p>
     <w:p>
@@ -815,22 +1948,6 @@
           <w:sz w:val="22"/>
           <w:szCs w:val="22"/>
         </w:rPr>
-        <w:t xml:space="preserve">11. #10 Economic Impact (Ohio)</w:t>
-      </w:r>
-    </w:p>
-    <w:p>
-      <w:pPr>
-        <w:pStyle w:val="Heading1"/>
-        <w:keepNext/>
-      </w:pPr>
-      <w:r>
-        <w:rPr>
-          <w:rFonts w:ascii="Times New Roman" w:cs="Times New Roman" w:eastAsia="Times New Roman" w:hAnsi="Times New Roman"/>
-          <w:b/>
-          <w:bCs/>
-          <w:sz w:val="22"/>
-          <w:szCs w:val="22"/>
-        </w:rPr>
         <w:t xml:space="preserve">#10  Economic Impact (Ohio)</w:t>
       </w:r>
     </w:p>
@@ -860,22 +1977,6 @@
           <w:szCs w:val="22"/>
         </w:rPr>
         <w:t xml:space="preserve">By partnering with local schools and builders for demos and training, it seeds a regional workforce pipeline and keeps concrete spend with local suppliers rather than proprietary-mortar vendors — compounding the in-state economic return of each job.</w:t>
-      </w:r>
-    </w:p>
-    <w:p>
-      <w:pPr>
-        <w:pStyle w:val="Heading1"/>
-        <w:keepNext/>
-      </w:pPr>
-      <w:r>
-        <w:rPr>
-          <w:rFonts w:ascii="Times New Roman" w:cs="Times New Roman" w:eastAsia="Times New Roman" w:hAnsi="Times New Roman"/>
-          <w:b/>
-          <w:bCs/>
-          <w:sz w:val="22"/>
-          <w:szCs w:val="22"/>
-        </w:rPr>
-        <w:t xml:space="preserve">12. #11 Project Plan (milestones)</w:t>
       </w:r>
     </w:p>
     <w:p>
@@ -1501,22 +2602,6 @@
           <w:sz w:val="22"/>
           <w:szCs w:val="22"/>
         </w:rPr>
-        <w:t xml:space="preserve">13. #12 Budget by spend type (Personnel/Equipment/Supplies/Purchased Services → OTF Project Funds + Total)</w:t>
-      </w:r>
-    </w:p>
-    <w:p>
-      <w:pPr>
-        <w:pStyle w:val="Heading1"/>
-        <w:keepNext/>
-      </w:pPr>
-      <w:r>
-        <w:rPr>
-          <w:rFonts w:ascii="Times New Roman" w:cs="Times New Roman" w:eastAsia="Times New Roman" w:hAnsi="Times New Roman"/>
-          <w:b/>
-          <w:bCs/>
-          <w:sz w:val="22"/>
-          <w:szCs w:val="22"/>
-        </w:rPr>
         <w:t xml:space="preserve">#12  Budget by Spend Type</w:t>
       </w:r>
     </w:p>
@@ -1912,1299 +2997,6 @@
           <w:szCs w:val="22"/>
         </w:rPr>
         <w:t xml:space="preserve">Narrative: the bulk of the grant funds Equipment (COTS + specialized parts to build the beta prototype with Converge) and Purchased Services (Converge engineering + software partner); Supplies cover concrete for prototype testing; Personnel covers founding-team time and the first technical hire.</w:t>
-      </w:r>
-    </w:p>
-    <w:p>
-      <w:pPr>
-        <w:pStyle w:val="Heading1"/>
-        <w:keepNext/>
-      </w:pPr>
-      <w:r>
-        <w:rPr>
-          <w:rFonts w:ascii="Times New Roman" w:cs="Times New Roman" w:eastAsia="Times New Roman" w:hAnsi="Times New Roman"/>
-          <w:b/>
-          <w:bCs/>
-          <w:sz w:val="22"/>
-          <w:szCs w:val="22"/>
-        </w:rPr>
-        <w:t xml:space="preserve">2. #1 Market Opportunity (TAM)</w:t>
-      </w:r>
-    </w:p>
-    <w:p>
-      <w:pPr>
-        <w:pStyle w:val="Heading1"/>
-        <w:keepNext/>
-      </w:pPr>
-      <w:r>
-        <w:rPr>
-          <w:rFonts w:ascii="Times New Roman" w:cs="Times New Roman" w:eastAsia="Times New Roman" w:hAnsi="Times New Roman"/>
-          <w:b/>
-          <w:bCs/>
-          <w:sz w:val="22"/>
-          <w:szCs w:val="22"/>
-        </w:rPr>
-        <w:t xml:space="preserve">#1  Market Opportunity (TAM)</w:t>
-      </w:r>
-    </w:p>
-    <w:p>
-      <w:pPr>
-        <w:spacing w:after="0" w:before="0"/>
-        <w:jc w:val="left"/>
-      </w:pPr>
-      <w:r>
-        <w:rPr>
-          <w:rFonts w:ascii="Times New Roman" w:cs="Times New Roman" w:eastAsia="Times New Roman" w:hAnsi="Times New Roman"/>
-          <w:sz w:val="22"/>
-          <w:szCs w:val="22"/>
-        </w:rPr>
-        <w:t xml:space="preserve">The 2026 U.S. housing market represents a $410B TAM against a structural ~500,000-home supply/demand gap; "locked-in" 6% mortgages push builders toward new-build "buy-down" economics where every point of cost removed matters. Foundation targets the formwork line item of single-family new builds — a $23.7B SAM — with an initial serviceable-obtainable $27.4M SOM in its regional beachhead.</w:t>
-      </w:r>
-    </w:p>
-    <w:p>
-      <w:pPr>
-        <w:spacing w:after="0" w:before="0"/>
-        <w:jc w:val="left"/>
-      </w:pPr>
-      <w:r>
-        <w:rPr>
-          <w:rFonts w:ascii="Times New Roman" w:cs="Times New Roman" w:eastAsia="Times New Roman" w:hAnsi="Times New Roman"/>
-          <w:sz w:val="22"/>
-          <w:szCs w:val="22"/>
-        </w:rPr>
-        <w:t xml:space="preserve">Because foundation 3D printing lowers total home cost ~4% while removing the industry's most labor-intensive, waste-prone step, it converts a cost center into a competitive advantage for builders operating on thin margins.</w:t>
-      </w:r>
-    </w:p>
-    <w:tbl>
-      <w:tblPr>
-        <w:tblW w:type="pct" w:w="100%"/>
-        <w:tblBorders>
-          <w:top w:val="single" w:color="auto" w:sz="4"/>
-          <w:left w:val="single" w:color="auto" w:sz="4"/>
-          <w:bottom w:val="single" w:color="auto" w:sz="4"/>
-          <w:right w:val="single" w:color="auto" w:sz="4"/>
-          <w:insideH w:val="single" w:color="auto" w:sz="4"/>
-          <w:insideV w:val="single" w:color="auto" w:sz="4"/>
-        </w:tblBorders>
-      </w:tblPr>
-      <w:tblGrid>
-        <w:gridCol w:w="100"/>
-        <w:gridCol w:w="100"/>
-        <w:gridCol w:w="100"/>
-      </w:tblGrid>
-      <w:tr>
-        <w:trPr>
-          <w:cantSplit/>
-        </w:trPr>
-        <w:tc>
-          <w:tcPr>
-            <w:tcW w:type="pct" w:w="33.333333333333336%"/>
-            <w:shd w:color="D9E1F2" w:val="solid"/>
-          </w:tcPr>
-          <w:p>
-            <w:pPr>
-              <w:jc w:val="center"/>
-            </w:pPr>
-            <w:r>
-              <w:rPr>
-                <w:rFonts w:ascii="Times New Roman" w:cs="Times New Roman" w:eastAsia="Times New Roman" w:hAnsi="Times New Roman"/>
-                <w:b/>
-                <w:bCs/>
-                <w:sz w:val="22"/>
-                <w:szCs w:val="22"/>
-              </w:rPr>
-              <w:t xml:space="preserve">Market layer</w:t>
-            </w:r>
-          </w:p>
-        </w:tc>
-        <w:tc>
-          <w:tcPr>
-            <w:tcW w:type="pct" w:w="33.333333333333336%"/>
-            <w:shd w:color="D9E1F2" w:val="solid"/>
-          </w:tcPr>
-          <w:p>
-            <w:pPr>
-              <w:jc w:val="center"/>
-            </w:pPr>
-            <w:r>
-              <w:rPr>
-                <w:rFonts w:ascii="Times New Roman" w:cs="Times New Roman" w:eastAsia="Times New Roman" w:hAnsi="Times New Roman"/>
-                <w:b/>
-                <w:bCs/>
-                <w:sz w:val="22"/>
-                <w:szCs w:val="22"/>
-              </w:rPr>
-              <w:t xml:space="preserve">Size</w:t>
-            </w:r>
-          </w:p>
-        </w:tc>
-        <w:tc>
-          <w:tcPr>
-            <w:tcW w:type="pct" w:w="33.333333333333336%"/>
-            <w:shd w:color="D9E1F2" w:val="solid"/>
-          </w:tcPr>
-          <w:p>
-            <w:pPr>
-              <w:jc w:val="center"/>
-            </w:pPr>
-            <w:r>
-              <w:rPr>
-                <w:rFonts w:ascii="Times New Roman" w:cs="Times New Roman" w:eastAsia="Times New Roman" w:hAnsi="Times New Roman"/>
-                <w:b/>
-                <w:bCs/>
-                <w:sz w:val="22"/>
-                <w:szCs w:val="22"/>
-              </w:rPr>
-              <w:t xml:space="preserve">Definition</w:t>
-            </w:r>
-          </w:p>
-        </w:tc>
-      </w:tr>
-      <w:tr>
-        <w:trPr>
-          <w:cantSplit/>
-        </w:trPr>
-        <w:tc>
-          <w:p>
-            <w:pPr>
-              <w:jc w:val="left"/>
-            </w:pPr>
-            <w:r>
-              <w:rPr>
-                <w:rFonts w:ascii="Times New Roman" w:cs="Times New Roman" w:eastAsia="Times New Roman" w:hAnsi="Times New Roman"/>
-                <w:b w:val="false"/>
-                <w:bCs w:val="false"/>
-                <w:sz w:val="22"/>
-                <w:szCs w:val="22"/>
-              </w:rPr>
-              <w:t xml:space="preserve">TAM</w:t>
-            </w:r>
-          </w:p>
-        </w:tc>
-        <w:tc>
-          <w:p>
-            <w:pPr>
-              <w:jc w:val="left"/>
-            </w:pPr>
-            <w:r>
-              <w:rPr>
-                <w:rFonts w:ascii="Times New Roman" w:cs="Times New Roman" w:eastAsia="Times New Roman" w:hAnsi="Times New Roman"/>
-                <w:b w:val="false"/>
-                <w:bCs w:val="false"/>
-                <w:sz w:val="22"/>
-                <w:szCs w:val="22"/>
-              </w:rPr>
-              <w:t xml:space="preserve">$410B</w:t>
-            </w:r>
-          </w:p>
-        </w:tc>
-        <w:tc>
-          <w:p>
-            <w:pPr>
-              <w:jc w:val="left"/>
-            </w:pPr>
-            <w:r>
-              <w:rPr>
-                <w:rFonts w:ascii="Times New Roman" w:cs="Times New Roman" w:eastAsia="Times New Roman" w:hAnsi="Times New Roman"/>
-                <w:b w:val="false"/>
-                <w:bCs w:val="false"/>
-                <w:sz w:val="22"/>
-                <w:szCs w:val="22"/>
-              </w:rPr>
-              <w:t xml:space="preserve">2026 U.S. housing market</w:t>
-            </w:r>
-          </w:p>
-        </w:tc>
-      </w:tr>
-      <w:tr>
-        <w:trPr>
-          <w:cantSplit/>
-        </w:trPr>
-        <w:tc>
-          <w:p>
-            <w:pPr>
-              <w:jc w:val="left"/>
-            </w:pPr>
-            <w:r>
-              <w:rPr>
-                <w:rFonts w:ascii="Times New Roman" w:cs="Times New Roman" w:eastAsia="Times New Roman" w:hAnsi="Times New Roman"/>
-                <w:b w:val="false"/>
-                <w:bCs w:val="false"/>
-                <w:sz w:val="22"/>
-                <w:szCs w:val="22"/>
-              </w:rPr>
-              <w:t xml:space="preserve">SAM</w:t>
-            </w:r>
-          </w:p>
-        </w:tc>
-        <w:tc>
-          <w:p>
-            <w:pPr>
-              <w:jc w:val="left"/>
-            </w:pPr>
-            <w:r>
-              <w:rPr>
-                <w:rFonts w:ascii="Times New Roman" w:cs="Times New Roman" w:eastAsia="Times New Roman" w:hAnsi="Times New Roman"/>
-                <w:b w:val="false"/>
-                <w:bCs w:val="false"/>
-                <w:sz w:val="22"/>
-                <w:szCs w:val="22"/>
-              </w:rPr>
-              <w:t xml:space="preserve">$23.7B</w:t>
-            </w:r>
-          </w:p>
-        </w:tc>
-        <w:tc>
-          <w:p>
-            <w:pPr>
-              <w:jc w:val="left"/>
-            </w:pPr>
-            <w:r>
-              <w:rPr>
-                <w:rFonts w:ascii="Times New Roman" w:cs="Times New Roman" w:eastAsia="Times New Roman" w:hAnsi="Times New Roman"/>
-                <w:b w:val="false"/>
-                <w:bCs w:val="false"/>
-                <w:sz w:val="22"/>
-                <w:szCs w:val="22"/>
-              </w:rPr>
-              <w:t xml:space="preserve">Formwork in single-family new builds</w:t>
-            </w:r>
-          </w:p>
-        </w:tc>
-      </w:tr>
-      <w:tr>
-        <w:trPr>
-          <w:cantSplit/>
-        </w:trPr>
-        <w:tc>
-          <w:p>
-            <w:pPr>
-              <w:jc w:val="left"/>
-            </w:pPr>
-            <w:r>
-              <w:rPr>
-                <w:rFonts w:ascii="Times New Roman" w:cs="Times New Roman" w:eastAsia="Times New Roman" w:hAnsi="Times New Roman"/>
-                <w:b w:val="false"/>
-                <w:bCs w:val="false"/>
-                <w:sz w:val="22"/>
-                <w:szCs w:val="22"/>
-              </w:rPr>
-              <w:t xml:space="preserve">SOM</w:t>
-            </w:r>
-          </w:p>
-        </w:tc>
-        <w:tc>
-          <w:p>
-            <w:pPr>
-              <w:jc w:val="left"/>
-            </w:pPr>
-            <w:r>
-              <w:rPr>
-                <w:rFonts w:ascii="Times New Roman" w:cs="Times New Roman" w:eastAsia="Times New Roman" w:hAnsi="Times New Roman"/>
-                <w:b w:val="false"/>
-                <w:bCs w:val="false"/>
-                <w:sz w:val="22"/>
-                <w:szCs w:val="22"/>
-              </w:rPr>
-              <w:t xml:space="preserve">$27.4M</w:t>
-            </w:r>
-          </w:p>
-        </w:tc>
-        <w:tc>
-          <w:p>
-            <w:pPr>
-              <w:jc w:val="left"/>
-            </w:pPr>
-            <w:r>
-              <w:rPr>
-                <w:rFonts w:ascii="Times New Roman" w:cs="Times New Roman" w:eastAsia="Times New Roman" w:hAnsi="Times New Roman"/>
-                <w:b w:val="false"/>
-                <w:bCs w:val="false"/>
-                <w:sz w:val="22"/>
-                <w:szCs w:val="22"/>
-              </w:rPr>
-              <w:t xml:space="preserve">Near-term regional beachhead</w:t>
-            </w:r>
-          </w:p>
-        </w:tc>
-      </w:tr>
-    </w:tbl>
-    <w:p>
-      <w:pPr>
-        <w:pStyle w:val="Heading1"/>
-        <w:keepNext/>
-      </w:pPr>
-      <w:r>
-        <w:rPr>
-          <w:rFonts w:ascii="Times New Roman" w:cs="Times New Roman" w:eastAsia="Times New Roman" w:hAnsi="Times New Roman"/>
-          <w:b/>
-          <w:bCs/>
-          <w:sz w:val="22"/>
-          <w:szCs w:val="22"/>
-        </w:rPr>
-        <w:t xml:space="preserve">3. #2 Overview of the Technology</w:t>
-      </w:r>
-    </w:p>
-    <w:p>
-      <w:pPr>
-        <w:pStyle w:val="Heading1"/>
-        <w:keepNext/>
-      </w:pPr>
-      <w:r>
-        <w:rPr>
-          <w:rFonts w:ascii="Times New Roman" w:cs="Times New Roman" w:eastAsia="Times New Roman" w:hAnsi="Times New Roman"/>
-          <w:b/>
-          <w:bCs/>
-          <w:sz w:val="22"/>
-          <w:szCs w:val="22"/>
-        </w:rPr>
-        <w:t xml:space="preserve">#2  Overview of the Technology</w:t>
-      </w:r>
-    </w:p>
-    <w:p>
-      <w:pPr>
-        <w:spacing w:after="0" w:before="0"/>
-        <w:jc w:val="left"/>
-      </w:pPr>
-      <w:r>
-        <w:rPr>
-          <w:rFonts w:ascii="Times New Roman" w:cs="Times New Roman" w:eastAsia="Times New Roman" w:hAnsi="Times New Roman"/>
-          <w:sz w:val="22"/>
-          <w:szCs w:val="22"/>
-        </w:rPr>
-        <w:t xml:space="preserve">Foundation's system prints a foundation's wall geometry directly: a build plan is downloaded to the printer, concrete is pumped into the machine, and the nozzle lays concrete one layer at a time. A printing trolley moves laterally and vertically while the whole machine travels along runway rails; the system is electrically powered.</w:t>
-      </w:r>
-    </w:p>
-    <w:p>
-      <w:pPr>
-        <w:spacing w:after="0" w:before="0"/>
-        <w:jc w:val="left"/>
-      </w:pPr>
-      <w:r>
-        <w:rPr>
-          <w:rFonts w:ascii="Times New Roman" w:cs="Times New Roman" w:eastAsia="Times New Roman" w:hAnsi="Times New Roman"/>
-          <w:sz w:val="22"/>
-          <w:szCs w:val="22"/>
-        </w:rPr>
-        <w:t xml:space="preserve">Two differentiators define it:</w:t>
-      </w:r>
-    </w:p>
-    <w:p>
-      <w:pPr>
-        <w:pStyle w:val="ListParagraph"/>
-        <w:numPr>
-          <w:ilvl w:val="0"/>
-          <w:numId w:val="1"/>
-        </w:numPr>
-      </w:pPr>
-      <w:r>
-        <w:rPr>
-          <w:rFonts w:ascii="Times New Roman" w:cs="Times New Roman" w:eastAsia="Times New Roman" w:hAnsi="Times New Roman"/>
-          <w:sz w:val="22"/>
-          <w:szCs w:val="22"/>
-        </w:rPr>
-        <w:t xml:space="preserve">It uses common, locally sourced concrete — not an expensive proprietary mortar.</w:t>
-      </w:r>
-    </w:p>
-    <w:p>
-      <w:pPr>
-        <w:pStyle w:val="ListParagraph"/>
-        <w:numPr>
-          <w:ilvl w:val="0"/>
-          <w:numId w:val="1"/>
-        </w:numPr>
-      </w:pPr>
-      <w:r>
-        <w:rPr>
-          <w:rFonts w:ascii="Times New Roman" w:cs="Times New Roman" w:eastAsia="Times New Roman" w:hAnsi="Times New Roman"/>
-          <w:sz w:val="22"/>
-          <w:szCs w:val="22"/>
-        </w:rPr>
-        <w:t xml:space="preserve">An external gate controls material flow at the nozzle, enabling clean starts/stops and consistent layers.</w:t>
-      </w:r>
-    </w:p>
-    <w:p>
-      <w:pPr>
-        <w:spacing w:after="0" w:before="0"/>
-        <w:jc w:val="left"/>
-      </w:pPr>
-      <w:r>
-        <w:rPr>
-          <w:rFonts w:ascii="Times New Roman" w:cs="Times New Roman" w:eastAsia="Times New Roman" w:hAnsi="Times New Roman"/>
-          <w:sz w:val="22"/>
-          <w:szCs w:val="22"/>
-        </w:rPr>
-        <w:t xml:space="preserve">The net effect eliminates the build-strip-repair-clean cycle, saving ~311 labor hours per home and cutting formwork production cost ~47–50% and material cost ~60–65% versus mortar-based concrete printers.</w:t>
-      </w:r>
-    </w:p>
-    <w:p>
-      <w:pPr>
-        <w:pStyle w:val="Heading1"/>
-        <w:keepNext/>
-      </w:pPr>
-      <w:r>
-        <w:rPr>
-          <w:rFonts w:ascii="Times New Roman" w:cs="Times New Roman" w:eastAsia="Times New Roman" w:hAnsi="Times New Roman"/>
-          <w:b/>
-          <w:bCs/>
-          <w:sz w:val="22"/>
-          <w:szCs w:val="22"/>
-        </w:rPr>
-        <w:t xml:space="preserve">4. #3 Development Stage</w:t>
-      </w:r>
-    </w:p>
-    <w:p>
-      <w:pPr>
-        <w:pStyle w:val="Heading1"/>
-        <w:keepNext/>
-      </w:pPr>
-      <w:r>
-        <w:rPr>
-          <w:rFonts w:ascii="Times New Roman" w:cs="Times New Roman" w:eastAsia="Times New Roman" w:hAnsi="Times New Roman"/>
-          <w:b/>
-          <w:bCs/>
-          <w:sz w:val="22"/>
-          <w:szCs w:val="22"/>
-        </w:rPr>
-        <w:t xml:space="preserve">#3  Development Stage</w:t>
-      </w:r>
-    </w:p>
-    <w:p>
-      <w:pPr>
-        <w:spacing w:after="0" w:before="0"/>
-        <w:jc w:val="left"/>
-      </w:pPr>
-      <w:r>
-        <w:rPr>
-          <w:rFonts w:ascii="Times New Roman" w:cs="Times New Roman" w:eastAsia="Times New Roman" w:hAnsi="Times New Roman"/>
-          <w:sz w:val="22"/>
-          <w:szCs w:val="22"/>
-        </w:rPr>
-        <w:t xml:space="preserve">The technology is at TRL 6–7: core subsystems (concrete delivery, nozzle gate, gantry motion) are demonstrated and the team is building a beta prototype for a relevant application environment. MVP customer requirements are explicit — rapid deployment, reduced labor, structural reliability, and use of locally sourced materials.</w:t>
-      </w:r>
-    </w:p>
-    <w:p>
-      <w:pPr>
-        <w:spacing w:after="0" w:before="0"/>
-        <w:jc w:val="left"/>
-      </w:pPr>
-      <w:r>
-        <w:rPr>
-          <w:rFonts w:ascii="Times New Roman" w:cs="Times New Roman" w:eastAsia="Times New Roman" w:hAnsi="Times New Roman"/>
-          <w:sz w:val="22"/>
-          <w:szCs w:val="22"/>
-        </w:rPr>
-        <w:t xml:space="preserve">TVSF's role is to fund the beta prototype build and an independent third-party performance validation, moving the system from demonstrated subsystems (TRL 6–7) toward a field-validated first printer (TRL 7–8).</w:t>
-      </w:r>
-    </w:p>
-    <w:p>
-      <w:pPr>
-        <w:pStyle w:val="Heading1"/>
-        <w:keepNext/>
-      </w:pPr>
-      <w:r>
-        <w:rPr>
-          <w:rFonts w:ascii="Times New Roman" w:cs="Times New Roman" w:eastAsia="Times New Roman" w:hAnsi="Times New Roman"/>
-          <w:b/>
-          <w:bCs/>
-          <w:sz w:val="22"/>
-          <w:szCs w:val="22"/>
-        </w:rPr>
-        <w:t xml:space="preserve">5. #4 Commercialization Strategy (SAM)</w:t>
-      </w:r>
-    </w:p>
-    <w:p>
-      <w:pPr>
-        <w:pStyle w:val="Heading1"/>
-        <w:keepNext/>
-      </w:pPr>
-      <w:r>
-        <w:rPr>
-          <w:rFonts w:ascii="Times New Roman" w:cs="Times New Roman" w:eastAsia="Times New Roman" w:hAnsi="Times New Roman"/>
-          <w:b/>
-          <w:bCs/>
-          <w:sz w:val="22"/>
-          <w:szCs w:val="22"/>
-        </w:rPr>
-        <w:t xml:space="preserve">#4  Commercialization Strategy (SAM)</w:t>
-      </w:r>
-    </w:p>
-    <w:p>
-      <w:pPr>
-        <w:spacing w:after="0" w:before="0"/>
-        <w:jc w:val="left"/>
-      </w:pPr>
-      <w:r>
-        <w:rPr>
-          <w:rFonts w:ascii="Times New Roman" w:cs="Times New Roman" w:eastAsia="Times New Roman" w:hAnsi="Times New Roman"/>
-          <w:sz w:val="22"/>
-          <w:szCs w:val="22"/>
-        </w:rPr>
-        <w:t xml:space="preserve">Entry is proof-based: local, fragmented buyers whose barriers are trust, portability, and cost, and whose workflow already relies on subcontractors. Foundation sells into that workflow as "printing as a service" to general contractors and developers, priced per cubic yard of concrete, and partners with local schools and builders for demos and workforce pipeline.</w:t>
-      </w:r>
-    </w:p>
-    <w:p>
-      <w:pPr>
-        <w:spacing w:after="0" w:before="0"/>
-        <w:jc w:val="left"/>
-      </w:pPr>
-      <w:r>
-        <w:rPr>
-          <w:rFonts w:ascii="Times New Roman" w:cs="Times New Roman" w:eastAsia="Times New Roman" w:hAnsi="Times New Roman"/>
-          <w:sz w:val="22"/>
-          <w:szCs w:val="22"/>
-        </w:rPr>
-        <w:t xml:space="preserve">The motion is demos/tours → paid pilot → repeat jobs, using non-dilutive TVSF + SBIR Phase I to reach a validated pilot before scaling into the $23.7B formwork SAM.</w:t>
-      </w:r>
-    </w:p>
-    <w:p>
-      <w:pPr>
-        <w:pStyle w:val="Heading1"/>
-        <w:keepNext/>
-      </w:pPr>
-      <w:r>
-        <w:rPr>
-          <w:rFonts w:ascii="Times New Roman" w:cs="Times New Roman" w:eastAsia="Times New Roman" w:hAnsi="Times New Roman"/>
-          <w:b/>
-          <w:bCs/>
-          <w:sz w:val="22"/>
-          <w:szCs w:val="22"/>
-        </w:rPr>
-        <w:t xml:space="preserve">6. #5 Intellectual Property</w:t>
-      </w:r>
-    </w:p>
-    <w:p>
-      <w:pPr>
-        <w:pStyle w:val="Heading1"/>
-        <w:keepNext/>
-      </w:pPr>
-      <w:r>
-        <w:rPr>
-          <w:rFonts w:ascii="Times New Roman" w:cs="Times New Roman" w:eastAsia="Times New Roman" w:hAnsi="Times New Roman"/>
-          <w:b/>
-          <w:bCs/>
-          <w:sz w:val="22"/>
-          <w:szCs w:val="22"/>
-        </w:rPr>
-        <w:t xml:space="preserve">#5  Intellectual Property</w:t>
-      </w:r>
-    </w:p>
-    <w:p>
-      <w:pPr>
-        <w:spacing w:after="0" w:before="0"/>
-        <w:jc w:val="left"/>
-      </w:pPr>
-      <w:r>
-        <w:rPr>
-          <w:rFonts w:ascii="Times New Roman" w:cs="Times New Roman" w:eastAsia="Times New Roman" w:hAnsi="Times New Roman"/>
-          <w:sz w:val="22"/>
-          <w:szCs w:val="22"/>
-        </w:rPr>
-        <w:t xml:space="preserve">Foundation's approach is anchored by two issued U.S. patents:</w:t>
-      </w:r>
-    </w:p>
-    <w:p>
-      <w:pPr>
-        <w:pStyle w:val="ListParagraph"/>
-        <w:numPr>
-          <w:ilvl w:val="0"/>
-          <w:numId w:val="1"/>
-        </w:numPr>
-      </w:pPr>
-      <w:r>
-        <w:rPr>
-          <w:rFonts w:ascii="Times New Roman" w:cs="Times New Roman" w:eastAsia="Times New Roman" w:hAnsi="Times New Roman"/>
-          <w:sz w:val="22"/>
-          <w:szCs w:val="22"/>
-        </w:rPr>
-        <w:t xml:space="preserve">U.S. Patent 11,273,574 — "Scalable Three-Dimensional Printing Apparatus" (the scalable gantry/print architecture).</w:t>
-      </w:r>
-    </w:p>
-    <w:p>
-      <w:pPr>
-        <w:pStyle w:val="ListParagraph"/>
-        <w:numPr>
-          <w:ilvl w:val="0"/>
-          <w:numId w:val="1"/>
-        </w:numPr>
-      </w:pPr>
-      <w:r>
-        <w:rPr>
-          <w:rFonts w:ascii="Times New Roman" w:cs="Times New Roman" w:eastAsia="Times New Roman" w:hAnsi="Times New Roman"/>
-          <w:sz w:val="22"/>
-          <w:szCs w:val="22"/>
-        </w:rPr>
-        <w:t xml:space="preserve">U.S. Patent 10,307,959 B2 — "Concrete Delivery System" (the concrete-delivery and nozzle-control mechanism).</w:t>
-      </w:r>
-    </w:p>
-    <w:p>
-      <w:pPr>
-        <w:spacing w:after="0" w:before="0"/>
-        <w:jc w:val="left"/>
-      </w:pPr>
-      <w:r>
-        <w:rPr>
-          <w:rFonts w:ascii="Times New Roman" w:cs="Times New Roman" w:eastAsia="Times New Roman" w:hAnsi="Times New Roman"/>
-          <w:sz w:val="22"/>
-          <w:szCs w:val="22"/>
-        </w:rPr>
-        <w:t xml:space="preserve">Together they protect the two core differentiators — the rail-scalable printer and the externally gated, local-concrete delivery path. Freedom-to-operate and a continuation strategy around the nozzle-gate control are part of the funded work.</w:t>
-      </w:r>
-    </w:p>
-    <w:p>
-      <w:pPr>
-        <w:pStyle w:val="Heading1"/>
-        <w:keepNext/>
-      </w:pPr>
-      <w:r>
-        <w:rPr>
-          <w:rFonts w:ascii="Times New Roman" w:cs="Times New Roman" w:eastAsia="Times New Roman" w:hAnsi="Times New Roman"/>
-          <w:b/>
-          <w:bCs/>
-          <w:sz w:val="22"/>
-          <w:szCs w:val="22"/>
-        </w:rPr>
-        <w:t xml:space="preserve">7. #6 Business Model &amp; Pro-forma P&amp;L</w:t>
-      </w:r>
-    </w:p>
-    <w:p>
-      <w:pPr>
-        <w:pStyle w:val="Heading1"/>
-        <w:keepNext/>
-      </w:pPr>
-      <w:r>
-        <w:rPr>
-          <w:rFonts w:ascii="Times New Roman" w:cs="Times New Roman" w:eastAsia="Times New Roman" w:hAnsi="Times New Roman"/>
-          <w:b/>
-          <w:bCs/>
-          <w:sz w:val="22"/>
-          <w:szCs w:val="22"/>
-        </w:rPr>
-        <w:t xml:space="preserve">#6  Business Model &amp; Pro-forma P&amp;L</w:t>
-      </w:r>
-    </w:p>
-    <w:p>
-      <w:pPr>
-        <w:spacing w:after="0" w:before="0"/>
-        <w:jc w:val="left"/>
-      </w:pPr>
-      <w:r>
-        <w:rPr>
-          <w:rFonts w:ascii="Times New Roman" w:cs="Times New Roman" w:eastAsia="Times New Roman" w:hAnsi="Times New Roman"/>
-          <w:sz w:val="22"/>
-          <w:szCs w:val="22"/>
-        </w:rPr>
-        <w:t xml:space="preserve">Foundation forms a joint venture per project, programs and prepares the print, and charges per cubic yard of concrete placed, at ≈$20,000 total price per job with a contribution margin of ≈37.5%. Printing-as-a-service keeps capital with Foundation and lowers the builder's barrier to adoption.</w:t>
-      </w:r>
-    </w:p>
-    <w:tbl>
-      <w:tblPr>
-        <w:tblW w:type="pct" w:w="100%"/>
-        <w:tblBorders>
-          <w:top w:val="single" w:color="auto" w:sz="4"/>
-          <w:left w:val="single" w:color="auto" w:sz="4"/>
-          <w:bottom w:val="single" w:color="auto" w:sz="4"/>
-          <w:right w:val="single" w:color="auto" w:sz="4"/>
-          <w:insideH w:val="single" w:color="auto" w:sz="4"/>
-          <w:insideV w:val="single" w:color="auto" w:sz="4"/>
-        </w:tblBorders>
-      </w:tblPr>
-      <w:tblGrid>
-        <w:gridCol w:w="100"/>
-        <w:gridCol w:w="100"/>
-      </w:tblGrid>
-      <w:tr>
-        <w:trPr>
-          <w:cantSplit/>
-        </w:trPr>
-        <w:tc>
-          <w:tcPr>
-            <w:tcW w:type="pct" w:w="50%"/>
-            <w:shd w:color="D9E1F2" w:val="solid"/>
-          </w:tcPr>
-          <w:p>
-            <w:pPr>
-              <w:jc w:val="center"/>
-            </w:pPr>
-            <w:r>
-              <w:rPr>
-                <w:rFonts w:ascii="Times New Roman" w:cs="Times New Roman" w:eastAsia="Times New Roman" w:hAnsi="Times New Roman"/>
-                <w:b/>
-                <w:bCs/>
-                <w:sz w:val="22"/>
-                <w:szCs w:val="22"/>
-              </w:rPr>
-              <w:t xml:space="preserve">Pro-forma (per job, illustrative)</w:t>
-            </w:r>
-          </w:p>
-        </w:tc>
-        <w:tc>
-          <w:tcPr>
-            <w:tcW w:type="pct" w:w="50%"/>
-            <w:shd w:color="D9E1F2" w:val="solid"/>
-          </w:tcPr>
-          <w:p>
-            <w:pPr>
-              <w:jc w:val="center"/>
-            </w:pPr>
-            <w:r>
-              <w:rPr>
-                <w:rFonts w:ascii="Times New Roman" w:cs="Times New Roman" w:eastAsia="Times New Roman" w:hAnsi="Times New Roman"/>
-                <w:b/>
-                <w:bCs/>
-                <w:sz w:val="22"/>
-                <w:szCs w:val="22"/>
-              </w:rPr>
-              <w:t xml:space="preserve">Value</w:t>
-            </w:r>
-          </w:p>
-        </w:tc>
-      </w:tr>
-      <w:tr>
-        <w:trPr>
-          <w:cantSplit/>
-        </w:trPr>
-        <w:tc>
-          <w:p>
-            <w:pPr>
-              <w:jc w:val="left"/>
-            </w:pPr>
-            <w:r>
-              <w:rPr>
-                <w:rFonts w:ascii="Times New Roman" w:cs="Times New Roman" w:eastAsia="Times New Roman" w:hAnsi="Times New Roman"/>
-                <w:b w:val="false"/>
-                <w:bCs w:val="false"/>
-                <w:sz w:val="22"/>
-                <w:szCs w:val="22"/>
-              </w:rPr>
-              <w:t xml:space="preserve">Price per job</w:t>
-            </w:r>
-          </w:p>
-        </w:tc>
-        <w:tc>
-          <w:p>
-            <w:pPr>
-              <w:jc w:val="left"/>
-            </w:pPr>
-            <w:r>
-              <w:rPr>
-                <w:rFonts w:ascii="Times New Roman" w:cs="Times New Roman" w:eastAsia="Times New Roman" w:hAnsi="Times New Roman"/>
-                <w:b w:val="false"/>
-                <w:bCs w:val="false"/>
-                <w:sz w:val="22"/>
-                <w:szCs w:val="22"/>
-              </w:rPr>
-              <w:t xml:space="preserve">$20,000</w:t>
-            </w:r>
-          </w:p>
-        </w:tc>
-      </w:tr>
-      <w:tr>
-        <w:trPr>
-          <w:cantSplit/>
-        </w:trPr>
-        <w:tc>
-          <w:p>
-            <w:pPr>
-              <w:jc w:val="left"/>
-            </w:pPr>
-            <w:r>
-              <w:rPr>
-                <w:rFonts w:ascii="Times New Roman" w:cs="Times New Roman" w:eastAsia="Times New Roman" w:hAnsi="Times New Roman"/>
-                <w:b w:val="false"/>
-                <w:bCs w:val="false"/>
-                <w:sz w:val="22"/>
-                <w:szCs w:val="22"/>
-              </w:rPr>
-              <w:t xml:space="preserve">Contribution margin</w:t>
-            </w:r>
-          </w:p>
-        </w:tc>
-        <w:tc>
-          <w:p>
-            <w:pPr>
-              <w:jc w:val="left"/>
-            </w:pPr>
-            <w:r>
-              <w:rPr>
-                <w:rFonts w:ascii="Times New Roman" w:cs="Times New Roman" w:eastAsia="Times New Roman" w:hAnsi="Times New Roman"/>
-                <w:b w:val="false"/>
-                <w:bCs w:val="false"/>
-                <w:sz w:val="22"/>
-                <w:szCs w:val="22"/>
-              </w:rPr>
-              <w:t xml:space="preserve">≈37.5%</w:t>
-            </w:r>
-          </w:p>
-        </w:tc>
-      </w:tr>
-      <w:tr>
-        <w:trPr>
-          <w:cantSplit/>
-        </w:trPr>
-        <w:tc>
-          <w:p>
-            <w:pPr>
-              <w:jc w:val="left"/>
-            </w:pPr>
-            <w:r>
-              <w:rPr>
-                <w:rFonts w:ascii="Times New Roman" w:cs="Times New Roman" w:eastAsia="Times New Roman" w:hAnsi="Times New Roman"/>
-                <w:b w:val="false"/>
-                <w:bCs w:val="false"/>
-                <w:sz w:val="22"/>
-                <w:szCs w:val="22"/>
-              </w:rPr>
-              <w:t xml:space="preserve">Contribution per job</w:t>
-            </w:r>
-          </w:p>
-        </w:tc>
-        <w:tc>
-          <w:p>
-            <w:pPr>
-              <w:jc w:val="left"/>
-            </w:pPr>
-            <w:r>
-              <w:rPr>
-                <w:rFonts w:ascii="Times New Roman" w:cs="Times New Roman" w:eastAsia="Times New Roman" w:hAnsi="Times New Roman"/>
-                <w:b w:val="false"/>
-                <w:bCs w:val="false"/>
-                <w:sz w:val="22"/>
-                <w:szCs w:val="22"/>
-              </w:rPr>
-              <w:t xml:space="preserve">$7,500</w:t>
-            </w:r>
-          </w:p>
-        </w:tc>
-      </w:tr>
-    </w:tbl>
-    <w:p>
-      <w:pPr>
-        <w:spacing w:after="0" w:before="0"/>
-        <w:jc w:val="left"/>
-      </w:pPr>
-      <w:r>
-        <w:rPr>
-          <w:rFonts w:ascii="Times New Roman" w:cs="Times New Roman" w:eastAsia="Times New Roman" w:hAnsi="Times New Roman"/>
-          <w:sz w:val="22"/>
-          <w:szCs w:val="22"/>
-        </w:rPr>
-        <w:t xml:space="preserve">Against a $27.4M near-term SOM, a modest fleet of printers running repeat jobs reaches sustainable unit economics quickly; gross margin expands as printer utilization rises.</w:t>
-      </w:r>
-    </w:p>
-    <w:p>
-      <w:pPr>
-        <w:pStyle w:val="Heading1"/>
-        <w:keepNext/>
-      </w:pPr>
-      <w:r>
-        <w:rPr>
-          <w:rFonts w:ascii="Times New Roman" w:cs="Times New Roman" w:eastAsia="Times New Roman" w:hAnsi="Times New Roman"/>
-          <w:b/>
-          <w:bCs/>
-          <w:sz w:val="22"/>
-          <w:szCs w:val="22"/>
-        </w:rPr>
-        <w:t xml:space="preserve">8. #7 Financial Stage (capital plan)</w:t>
-      </w:r>
-    </w:p>
-    <w:p>
-      <w:pPr>
-        <w:pStyle w:val="Heading1"/>
-        <w:keepNext/>
-      </w:pPr>
-      <w:r>
-        <w:rPr>
-          <w:rFonts w:ascii="Times New Roman" w:cs="Times New Roman" w:eastAsia="Times New Roman" w:hAnsi="Times New Roman"/>
-          <w:b/>
-          <w:bCs/>
-          <w:sz w:val="22"/>
-          <w:szCs w:val="22"/>
-        </w:rPr>
-        <w:t xml:space="preserve">#7  Current Financial Stage &amp; Fundraising</w:t>
-      </w:r>
-    </w:p>
-    <w:p>
-      <w:pPr>
-        <w:spacing w:after="0" w:before="0"/>
-        <w:jc w:val="left"/>
-      </w:pPr>
-      <w:r>
-        <w:rPr>
-          <w:rFonts w:ascii="Times New Roman" w:cs="Times New Roman" w:eastAsia="Times New Roman" w:hAnsi="Times New Roman"/>
-          <w:sz w:val="22"/>
-          <w:szCs w:val="22"/>
-        </w:rPr>
-        <w:t xml:space="preserve">Foundation is pre-seed. The capital plan pairs $200k TVSF and $150k SBIR Phase I (non-dilutive, directed at R&amp;D and the beta prototype) with a targeted $1.8M+ equity round.</w:t>
-      </w:r>
-    </w:p>
-    <w:p>
-      <w:pPr>
-        <w:spacing w:after="0" w:before="0"/>
-        <w:jc w:val="left"/>
-      </w:pPr>
-      <w:r>
-        <w:rPr>
-          <w:rFonts w:ascii="Times New Roman" w:cs="Times New Roman" w:eastAsia="Times New Roman" w:hAnsi="Times New Roman"/>
-          <w:sz w:val="22"/>
-          <w:szCs w:val="22"/>
-        </w:rPr>
-        <w:t xml:space="preserve">Equity investment is critical to scaling beyond the first printer; the non-dilutive grants exist to prove the market and de-risk the technology first, so the equity raise is priced on validated performance rather than on a concept. TVSF is the near-term unlock for the validated beta prototype that makes the round investable.</w:t>
-      </w:r>
-    </w:p>
-    <w:p>
-      <w:pPr>
-        <w:pStyle w:val="Heading1"/>
-        <w:keepNext/>
-      </w:pPr>
-      <w:r>
-        <w:rPr>
-          <w:rFonts w:ascii="Times New Roman" w:cs="Times New Roman" w:eastAsia="Times New Roman" w:hAnsi="Times New Roman"/>
-          <w:b/>
-          <w:bCs/>
-          <w:sz w:val="22"/>
-          <w:szCs w:val="22"/>
-        </w:rPr>
-        <w:t xml:space="preserve">9. #8 Team / Management</w:t>
-      </w:r>
-    </w:p>
-    <w:p>
-      <w:pPr>
-        <w:pStyle w:val="Heading1"/>
-        <w:keepNext/>
-      </w:pPr>
-      <w:r>
-        <w:rPr>
-          <w:rFonts w:ascii="Times New Roman" w:cs="Times New Roman" w:eastAsia="Times New Roman" w:hAnsi="Times New Roman"/>
-          <w:b/>
-          <w:bCs/>
-          <w:sz w:val="22"/>
-          <w:szCs w:val="22"/>
-        </w:rPr>
-        <w:t xml:space="preserve">#8  Team / Management</w:t>
-      </w:r>
-    </w:p>
-    <w:tbl>
-      <w:tblPr>
-        <w:tblW w:type="pct" w:w="100%"/>
-        <w:tblBorders>
-          <w:top w:val="single" w:color="auto" w:sz="4"/>
-          <w:left w:val="single" w:color="auto" w:sz="4"/>
-          <w:bottom w:val="single" w:color="auto" w:sz="4"/>
-          <w:right w:val="single" w:color="auto" w:sz="4"/>
-          <w:insideH w:val="single" w:color="auto" w:sz="4"/>
-          <w:insideV w:val="single" w:color="auto" w:sz="4"/>
-        </w:tblBorders>
-      </w:tblPr>
-      <w:tblGrid>
-        <w:gridCol w:w="100"/>
-        <w:gridCol w:w="100"/>
-        <w:gridCol w:w="100"/>
-      </w:tblGrid>
-      <w:tr>
-        <w:trPr>
-          <w:cantSplit/>
-        </w:trPr>
-        <w:tc>
-          <w:tcPr>
-            <w:tcW w:type="pct" w:w="33.333333333333336%"/>
-            <w:shd w:color="D9E1F2" w:val="solid"/>
-          </w:tcPr>
-          <w:p>
-            <w:pPr>
-              <w:jc w:val="center"/>
-            </w:pPr>
-            <w:r>
-              <w:rPr>
-                <w:rFonts w:ascii="Times New Roman" w:cs="Times New Roman" w:eastAsia="Times New Roman" w:hAnsi="Times New Roman"/>
-                <w:b/>
-                <w:bCs/>
-                <w:sz w:val="22"/>
-                <w:szCs w:val="22"/>
-              </w:rPr>
-              <w:t xml:space="preserve">Name</w:t>
-            </w:r>
-          </w:p>
-        </w:tc>
-        <w:tc>
-          <w:tcPr>
-            <w:tcW w:type="pct" w:w="33.333333333333336%"/>
-            <w:shd w:color="D9E1F2" w:val="solid"/>
-          </w:tcPr>
-          <w:p>
-            <w:pPr>
-              <w:jc w:val="center"/>
-            </w:pPr>
-            <w:r>
-              <w:rPr>
-                <w:rFonts w:ascii="Times New Roman" w:cs="Times New Roman" w:eastAsia="Times New Roman" w:hAnsi="Times New Roman"/>
-                <w:b/>
-                <w:bCs/>
-                <w:sz w:val="22"/>
-                <w:szCs w:val="22"/>
-              </w:rPr>
-              <w:t xml:space="preserve">Role</w:t>
-            </w:r>
-          </w:p>
-        </w:tc>
-        <w:tc>
-          <w:tcPr>
-            <w:tcW w:type="pct" w:w="33.333333333333336%"/>
-            <w:shd w:color="D9E1F2" w:val="solid"/>
-          </w:tcPr>
-          <w:p>
-            <w:pPr>
-              <w:jc w:val="center"/>
-            </w:pPr>
-            <w:r>
-              <w:rPr>
-                <w:rFonts w:ascii="Times New Roman" w:cs="Times New Roman" w:eastAsia="Times New Roman" w:hAnsi="Times New Roman"/>
-                <w:b/>
-                <w:bCs/>
-                <w:sz w:val="22"/>
-                <w:szCs w:val="22"/>
-              </w:rPr>
-              <w:t xml:space="preserve">Owns</w:t>
-            </w:r>
-          </w:p>
-        </w:tc>
-      </w:tr>
-      <w:tr>
-        <w:trPr>
-          <w:cantSplit/>
-        </w:trPr>
-        <w:tc>
-          <w:p>
-            <w:pPr>
-              <w:jc w:val="left"/>
-            </w:pPr>
-            <w:r>
-              <w:rPr>
-                <w:rFonts w:ascii="Times New Roman" w:cs="Times New Roman" w:eastAsia="Times New Roman" w:hAnsi="Times New Roman"/>
-                <w:b w:val="false"/>
-                <w:bCs w:val="false"/>
-                <w:sz w:val="22"/>
-                <w:szCs w:val="22"/>
-              </w:rPr>
-              <w:t xml:space="preserve">Kate Ulepic</w:t>
-            </w:r>
-          </w:p>
-        </w:tc>
-        <w:tc>
-          <w:p>
-            <w:pPr>
-              <w:jc w:val="left"/>
-            </w:pPr>
-            <w:r>
-              <w:rPr>
-                <w:rFonts w:ascii="Times New Roman" w:cs="Times New Roman" w:eastAsia="Times New Roman" w:hAnsi="Times New Roman"/>
-                <w:b w:val="false"/>
-                <w:bCs w:val="false"/>
-                <w:sz w:val="22"/>
-                <w:szCs w:val="22"/>
-              </w:rPr>
-              <w:t xml:space="preserve">Chief Executive Officer</w:t>
-            </w:r>
-          </w:p>
-        </w:tc>
-        <w:tc>
-          <w:p>
-            <w:pPr>
-              <w:jc w:val="left"/>
-            </w:pPr>
-            <w:r>
-              <w:rPr>
-                <w:rFonts w:ascii="Times New Roman" w:cs="Times New Roman" w:eastAsia="Times New Roman" w:hAnsi="Times New Roman"/>
-                <w:b w:val="false"/>
-                <w:bCs w:val="false"/>
-                <w:sz w:val="22"/>
-                <w:szCs w:val="22"/>
-              </w:rPr>
-              <w:t xml:space="preserve">Strategy &amp; fundraising</w:t>
-            </w:r>
-          </w:p>
-        </w:tc>
-      </w:tr>
-      <w:tr>
-        <w:trPr>
-          <w:cantSplit/>
-        </w:trPr>
-        <w:tc>
-          <w:p>
-            <w:pPr>
-              <w:jc w:val="left"/>
-            </w:pPr>
-            <w:r>
-              <w:rPr>
-                <w:rFonts w:ascii="Times New Roman" w:cs="Times New Roman" w:eastAsia="Times New Roman" w:hAnsi="Times New Roman"/>
-                <w:b w:val="false"/>
-                <w:bCs w:val="false"/>
-                <w:sz w:val="22"/>
-                <w:szCs w:val="22"/>
-              </w:rPr>
-              <w:t xml:space="preserve">Conor Atkins</w:t>
-            </w:r>
-          </w:p>
-        </w:tc>
-        <w:tc>
-          <w:p>
-            <w:pPr>
-              <w:jc w:val="left"/>
-            </w:pPr>
-            <w:r>
-              <w:rPr>
-                <w:rFonts w:ascii="Times New Roman" w:cs="Times New Roman" w:eastAsia="Times New Roman" w:hAnsi="Times New Roman"/>
-                <w:b w:val="false"/>
-                <w:bCs w:val="false"/>
-                <w:sz w:val="22"/>
-                <w:szCs w:val="22"/>
-              </w:rPr>
-              <w:t xml:space="preserve">Chief Operations Officer</w:t>
-            </w:r>
-          </w:p>
-        </w:tc>
-        <w:tc>
-          <w:p>
-            <w:pPr>
-              <w:jc w:val="left"/>
-            </w:pPr>
-            <w:r>
-              <w:rPr>
-                <w:rFonts w:ascii="Times New Roman" w:cs="Times New Roman" w:eastAsia="Times New Roman" w:hAnsi="Times New Roman"/>
-                <w:b w:val="false"/>
-                <w:bCs w:val="false"/>
-                <w:sz w:val="22"/>
-                <w:szCs w:val="22"/>
-              </w:rPr>
-              <w:t xml:space="preserve">Operations &amp; print execution</w:t>
-            </w:r>
-          </w:p>
-        </w:tc>
-      </w:tr>
-      <w:tr>
-        <w:trPr>
-          <w:cantSplit/>
-        </w:trPr>
-        <w:tc>
-          <w:p>
-            <w:pPr>
-              <w:jc w:val="left"/>
-            </w:pPr>
-            <w:r>
-              <w:rPr>
-                <w:rFonts w:ascii="Times New Roman" w:cs="Times New Roman" w:eastAsia="Times New Roman" w:hAnsi="Times New Roman"/>
-                <w:b w:val="false"/>
-                <w:bCs w:val="false"/>
-                <w:sz w:val="22"/>
-                <w:szCs w:val="22"/>
-              </w:rPr>
-              <w:t xml:space="preserve">Connor Casey</w:t>
-            </w:r>
-          </w:p>
-        </w:tc>
-        <w:tc>
-          <w:p>
-            <w:pPr>
-              <w:jc w:val="left"/>
-            </w:pPr>
-            <w:r>
-              <w:rPr>
-                <w:rFonts w:ascii="Times New Roman" w:cs="Times New Roman" w:eastAsia="Times New Roman" w:hAnsi="Times New Roman"/>
-                <w:b w:val="false"/>
-                <w:bCs w:val="false"/>
-                <w:sz w:val="22"/>
-                <w:szCs w:val="22"/>
-              </w:rPr>
-              <w:t xml:space="preserve">Chief Financial Officer</w:t>
-            </w:r>
-          </w:p>
-        </w:tc>
-        <w:tc>
-          <w:p>
-            <w:pPr>
-              <w:jc w:val="left"/>
-            </w:pPr>
-            <w:r>
-              <w:rPr>
-                <w:rFonts w:ascii="Times New Roman" w:cs="Times New Roman" w:eastAsia="Times New Roman" w:hAnsi="Times New Roman"/>
-                <w:b w:val="false"/>
-                <w:bCs w:val="false"/>
-                <w:sz w:val="22"/>
-                <w:szCs w:val="22"/>
-              </w:rPr>
-              <w:t xml:space="preserve">Finance &amp; capital plan</w:t>
-            </w:r>
-          </w:p>
-        </w:tc>
-      </w:tr>
-      <w:tr>
-        <w:trPr>
-          <w:cantSplit/>
-        </w:trPr>
-        <w:tc>
-          <w:p>
-            <w:pPr>
-              <w:jc w:val="left"/>
-            </w:pPr>
-            <w:r>
-              <w:rPr>
-                <w:rFonts w:ascii="Times New Roman" w:cs="Times New Roman" w:eastAsia="Times New Roman" w:hAnsi="Times New Roman"/>
-                <w:b w:val="false"/>
-                <w:bCs w:val="false"/>
-                <w:sz w:val="22"/>
-                <w:szCs w:val="22"/>
-              </w:rPr>
-              <w:t xml:space="preserve">Will Curley</w:t>
-            </w:r>
-          </w:p>
-        </w:tc>
-        <w:tc>
-          <w:p>
-            <w:pPr>
-              <w:jc w:val="left"/>
-            </w:pPr>
-            <w:r>
-              <w:rPr>
-                <w:rFonts w:ascii="Times New Roman" w:cs="Times New Roman" w:eastAsia="Times New Roman" w:hAnsi="Times New Roman"/>
-                <w:b w:val="false"/>
-                <w:bCs w:val="false"/>
-                <w:sz w:val="22"/>
-                <w:szCs w:val="22"/>
-              </w:rPr>
-              <w:t xml:space="preserve">Chief Technology Officer</w:t>
-            </w:r>
-          </w:p>
-        </w:tc>
-        <w:tc>
-          <w:p>
-            <w:pPr>
-              <w:jc w:val="left"/>
-            </w:pPr>
-            <w:r>
-              <w:rPr>
-                <w:rFonts w:ascii="Times New Roman" w:cs="Times New Roman" w:eastAsia="Times New Roman" w:hAnsi="Times New Roman"/>
-                <w:b w:val="false"/>
-                <w:bCs w:val="false"/>
-                <w:sz w:val="22"/>
-                <w:szCs w:val="22"/>
-              </w:rPr>
-              <w:t xml:space="preserve">Printer &amp; delivery technology</w:t>
-            </w:r>
-          </w:p>
-        </w:tc>
-      </w:tr>
-    </w:tbl>
-    <w:p>
-      <w:pPr>
-        <w:spacing w:after="0" w:before="0"/>
-        <w:jc w:val="left"/>
-      </w:pPr>
-      <w:r>
-        <w:rPr>
-          <w:rFonts w:ascii="Times New Roman" w:cs="Times New Roman" w:eastAsia="Times New Roman" w:hAnsi="Times New Roman"/>
-          <w:sz w:val="22"/>
-          <w:szCs w:val="22"/>
-        </w:rPr>
-        <w:t xml:space="preserve">The team has identified and is actively recruiting for its known gaps — legal advisor, fundraiser, technician, and homebuilder partner — and is mentored through the Entrepreneurs' Center (Paul Jackson, VP Strategic Programs).</w:t>
       </w:r>
     </w:p>
     <w:sectPr>

</xml_diff>